<commit_message>
Add date of submission to report title page
</commit_message>
<xml_diff>
--- a/report/Nakul_T_24AD068_EDA_Case_Study.docx
+++ b/report/Nakul_T_24AD068_EDA_Case_Study.docx
@@ -12,7 +12,7 @@
           <w:noProof/>
         </w:rPr>
         <w:drawing>
-          <wp:inline distT="0" distB="0" distL="0" distR="0" wp14:anchorId="1C2A6B4C" wp14:editId="2262FEEE">
+          <wp:inline distT="0" distB="0" distL="0" distR="0" wp14:anchorId="41291A18" wp14:editId="60DAEFA5">
             <wp:extent cx="5486400" cy="957015"/>
             <wp:effectExtent l="0" t="0" r="0" b="0"/>
             <wp:docPr id="1" name="Picture 1"/>
@@ -114,7 +114,16 @@
     </w:p>
     <w:p>
       <w:pPr>
-        <w:spacing w:before="2680" w:after="0" w:line="259" w:lineRule="auto"/>
+        <w:spacing w:before="160" w:after="0" w:line="259" w:lineRule="auto"/>
+        <w:jc w:val="center"/>
+      </w:pPr>
+      <w:r>
+        <w:t>Date of Submission: 12/10/2026</w:t>
+      </w:r>
+    </w:p>
+    <w:p>
+      <w:pPr>
+        <w:spacing w:before="2240" w:after="0" w:line="259" w:lineRule="auto"/>
         <w:jc w:val="center"/>
       </w:pPr>
       <w:r>
@@ -207,7 +216,7 @@
       <w:r>
         <w:fldChar w:fldCharType="separate"/>
       </w:r>
-      <w:hyperlink w:anchor="_Toc242714261" w:history="1">
+      <w:hyperlink w:anchor="_Toc242726550" w:history="1">
         <w:r>
           <w:rPr>
             <w:rStyle w:val="Hyperlink"/>
@@ -234,7 +243,7 @@
             <w:noProof/>
             <w:webHidden/>
           </w:rPr>
-          <w:instrText xml:space="preserve"> PAGEREF _Toc242714261 \h </w:instrText>
+          <w:instrText xml:space="preserve"> PAGEREF _Toc242726550 \h </w:instrText>
         </w:r>
         <w:r>
           <w:rPr>
@@ -282,7 +291,7 @@
           <w14:ligatures w14:val="standardContextual"/>
         </w:rPr>
       </w:pPr>
-      <w:hyperlink w:anchor="_Toc242714262" w:history="1">
+      <w:hyperlink w:anchor="_Toc242726551" w:history="1">
         <w:r>
           <w:rPr>
             <w:rStyle w:val="Hyperlink"/>
@@ -309,7 +318,7 @@
             <w:noProof/>
             <w:webHidden/>
           </w:rPr>
-          <w:instrText xml:space="preserve"> PAGEREF _Toc242714262 \h </w:instrText>
+          <w:instrText xml:space="preserve"> PAGEREF _Toc242726551 \h </w:instrText>
         </w:r>
         <w:r>
           <w:rPr>
@@ -357,7 +366,7 @@
           <w14:ligatures w14:val="standardContextual"/>
         </w:rPr>
       </w:pPr>
-      <w:hyperlink w:anchor="_Toc242714263" w:history="1">
+      <w:hyperlink w:anchor="_Toc242726552" w:history="1">
         <w:r>
           <w:rPr>
             <w:rStyle w:val="Hyperlink"/>
@@ -384,7 +393,7 @@
             <w:noProof/>
             <w:webHidden/>
           </w:rPr>
-          <w:instrText xml:space="preserve"> PAGEREF _Toc242714263 \h </w:instrText>
+          <w:instrText xml:space="preserve"> PAGEREF _Toc242726552 \h </w:instrText>
         </w:r>
         <w:r>
           <w:rPr>
@@ -432,7 +441,7 @@
           <w14:ligatures w14:val="standardContextual"/>
         </w:rPr>
       </w:pPr>
-      <w:hyperlink w:anchor="_Toc242714264" w:history="1">
+      <w:hyperlink w:anchor="_Toc242726553" w:history="1">
         <w:r>
           <w:rPr>
             <w:rStyle w:val="Hyperlink"/>
@@ -459,7 +468,7 @@
             <w:noProof/>
             <w:webHidden/>
           </w:rPr>
-          <w:instrText xml:space="preserve"> PAGEREF _Toc242714264 \h </w:instrText>
+          <w:instrText xml:space="preserve"> PAGEREF _Toc242726553 \h </w:instrText>
         </w:r>
         <w:r>
           <w:rPr>
@@ -507,7 +516,7 @@
           <w14:ligatures w14:val="standardContextual"/>
         </w:rPr>
       </w:pPr>
-      <w:hyperlink w:anchor="_Toc242714265" w:history="1">
+      <w:hyperlink w:anchor="_Toc242726554" w:history="1">
         <w:r>
           <w:rPr>
             <w:rStyle w:val="Hyperlink"/>
@@ -534,7 +543,7 @@
             <w:noProof/>
             <w:webHidden/>
           </w:rPr>
-          <w:instrText xml:space="preserve"> PAGEREF _Toc242714265 \h </w:instrText>
+          <w:instrText xml:space="preserve"> PAGEREF _Toc242726554 \h </w:instrText>
         </w:r>
         <w:r>
           <w:rPr>
@@ -582,7 +591,7 @@
           <w14:ligatures w14:val="standardContextual"/>
         </w:rPr>
       </w:pPr>
-      <w:hyperlink w:anchor="_Toc242714266" w:history="1">
+      <w:hyperlink w:anchor="_Toc242726555" w:history="1">
         <w:r>
           <w:rPr>
             <w:rStyle w:val="Hyperlink"/>
@@ -609,7 +618,7 @@
             <w:noProof/>
             <w:webHidden/>
           </w:rPr>
-          <w:instrText xml:space="preserve"> PAGEREF _Toc242714266 \h </w:instrText>
+          <w:instrText xml:space="preserve"> PAGEREF _Toc242726555 \h </w:instrText>
         </w:r>
         <w:r>
           <w:rPr>
@@ -657,7 +666,7 @@
           <w14:ligatures w14:val="standardContextual"/>
         </w:rPr>
       </w:pPr>
-      <w:hyperlink w:anchor="_Toc242714267" w:history="1">
+      <w:hyperlink w:anchor="_Toc242726556" w:history="1">
         <w:r>
           <w:rPr>
             <w:rStyle w:val="Hyperlink"/>
@@ -684,7 +693,7 @@
             <w:noProof/>
             <w:webHidden/>
           </w:rPr>
-          <w:instrText xml:space="preserve"> PAGEREF _Toc242714267 \h </w:instrText>
+          <w:instrText xml:space="preserve"> PAGEREF _Toc242726556 \h </w:instrText>
         </w:r>
         <w:r>
           <w:rPr>
@@ -732,7 +741,7 @@
           <w14:ligatures w14:val="standardContextual"/>
         </w:rPr>
       </w:pPr>
-      <w:hyperlink w:anchor="_Toc242714268" w:history="1">
+      <w:hyperlink w:anchor="_Toc242726557" w:history="1">
         <w:r>
           <w:rPr>
             <w:rStyle w:val="Hyperlink"/>
@@ -759,7 +768,7 @@
             <w:noProof/>
             <w:webHidden/>
           </w:rPr>
-          <w:instrText xml:space="preserve"> PAGEREF _Toc242714268 \h </w:instrText>
+          <w:instrText xml:space="preserve"> PAGEREF _Toc242726557 \h </w:instrText>
         </w:r>
         <w:r>
           <w:rPr>
@@ -807,7 +816,7 @@
           <w14:ligatures w14:val="standardContextual"/>
         </w:rPr>
       </w:pPr>
-      <w:hyperlink w:anchor="_Toc242714269" w:history="1">
+      <w:hyperlink w:anchor="_Toc242726558" w:history="1">
         <w:r>
           <w:rPr>
             <w:rStyle w:val="Hyperlink"/>
@@ -834,7 +843,7 @@
             <w:noProof/>
             <w:webHidden/>
           </w:rPr>
-          <w:instrText xml:space="preserve"> PAGEREF _Toc242714269 \h </w:instrText>
+          <w:instrText xml:space="preserve"> PAGEREF _Toc242726558 \h </w:instrText>
         </w:r>
         <w:r>
           <w:rPr>
@@ -882,7 +891,7 @@
           <w14:ligatures w14:val="standardContextual"/>
         </w:rPr>
       </w:pPr>
-      <w:hyperlink w:anchor="_Toc242714270" w:history="1">
+      <w:hyperlink w:anchor="_Toc242726559" w:history="1">
         <w:r>
           <w:rPr>
             <w:rStyle w:val="Hyperlink"/>
@@ -909,7 +918,7 @@
             <w:noProof/>
             <w:webHidden/>
           </w:rPr>
-          <w:instrText xml:space="preserve"> PAGEREF _Toc242714270 \h </w:instrText>
+          <w:instrText xml:space="preserve"> PAGEREF _Toc242726559 \h </w:instrText>
         </w:r>
         <w:r>
           <w:rPr>
@@ -957,7 +966,7 @@
           <w14:ligatures w14:val="standardContextual"/>
         </w:rPr>
       </w:pPr>
-      <w:hyperlink w:anchor="_Toc242714271" w:history="1">
+      <w:hyperlink w:anchor="_Toc242726560" w:history="1">
         <w:r>
           <w:rPr>
             <w:rStyle w:val="Hyperlink"/>
@@ -984,7 +993,7 @@
             <w:noProof/>
             <w:webHidden/>
           </w:rPr>
-          <w:instrText xml:space="preserve"> PAGEREF _Toc242714271 \h </w:instrText>
+          <w:instrText xml:space="preserve"> PAGEREF _Toc242726560 \h </w:instrText>
         </w:r>
         <w:r>
           <w:rPr>
@@ -1032,7 +1041,7 @@
           <w14:ligatures w14:val="standardContextual"/>
         </w:rPr>
       </w:pPr>
-      <w:hyperlink w:anchor="_Toc242714272" w:history="1">
+      <w:hyperlink w:anchor="_Toc242726561" w:history="1">
         <w:r>
           <w:rPr>
             <w:rStyle w:val="Hyperlink"/>
@@ -1059,7 +1068,7 @@
             <w:noProof/>
             <w:webHidden/>
           </w:rPr>
-          <w:instrText xml:space="preserve"> PAGEREF _Toc242714272 \h </w:instrText>
+          <w:instrText xml:space="preserve"> PAGEREF _Toc242726561 \h </w:instrText>
         </w:r>
         <w:r>
           <w:rPr>
@@ -1107,7 +1116,7 @@
           <w14:ligatures w14:val="standardContextual"/>
         </w:rPr>
       </w:pPr>
-      <w:hyperlink w:anchor="_Toc242714273" w:history="1">
+      <w:hyperlink w:anchor="_Toc242726562" w:history="1">
         <w:r>
           <w:rPr>
             <w:rStyle w:val="Hyperlink"/>
@@ -1134,7 +1143,7 @@
             <w:noProof/>
             <w:webHidden/>
           </w:rPr>
-          <w:instrText xml:space="preserve"> PAGEREF _Toc242714273 \h </w:instrText>
+          <w:instrText xml:space="preserve"> PAGEREF _Toc242726562 \h </w:instrText>
         </w:r>
         <w:r>
           <w:rPr>
@@ -1182,7 +1191,7 @@
           <w14:ligatures w14:val="standardContextual"/>
         </w:rPr>
       </w:pPr>
-      <w:hyperlink w:anchor="_Toc242714274" w:history="1">
+      <w:hyperlink w:anchor="_Toc242726563" w:history="1">
         <w:r>
           <w:rPr>
             <w:rStyle w:val="Hyperlink"/>
@@ -1209,7 +1218,7 @@
             <w:noProof/>
             <w:webHidden/>
           </w:rPr>
-          <w:instrText xml:space="preserve"> PAGEREF _Toc242714274 \h </w:instrText>
+          <w:instrText xml:space="preserve"> PAGEREF _Toc242726563 \h </w:instrText>
         </w:r>
         <w:r>
           <w:rPr>
@@ -1257,7 +1266,7 @@
           <w14:ligatures w14:val="standardContextual"/>
         </w:rPr>
       </w:pPr>
-      <w:hyperlink w:anchor="_Toc242714275" w:history="1">
+      <w:hyperlink w:anchor="_Toc242726564" w:history="1">
         <w:r>
           <w:rPr>
             <w:rStyle w:val="Hyperlink"/>
@@ -1284,7 +1293,7 @@
             <w:noProof/>
             <w:webHidden/>
           </w:rPr>
-          <w:instrText xml:space="preserve"> PAGEREF _Toc242714275 \h </w:instrText>
+          <w:instrText xml:space="preserve"> PAGEREF _Toc242726564 \h </w:instrText>
         </w:r>
         <w:r>
           <w:rPr>
@@ -1332,7 +1341,7 @@
           <w14:ligatures w14:val="standardContextual"/>
         </w:rPr>
       </w:pPr>
-      <w:hyperlink w:anchor="_Toc242714276" w:history="1">
+      <w:hyperlink w:anchor="_Toc242726565" w:history="1">
         <w:r>
           <w:rPr>
             <w:rStyle w:val="Hyperlink"/>
@@ -1359,7 +1368,7 @@
             <w:noProof/>
             <w:webHidden/>
           </w:rPr>
-          <w:instrText xml:space="preserve"> PAGEREF _Toc242714276 \h </w:instrText>
+          <w:instrText xml:space="preserve"> PAGEREF _Toc242726565 \h </w:instrText>
         </w:r>
         <w:r>
           <w:rPr>
@@ -1407,7 +1416,7 @@
           <w14:ligatures w14:val="standardContextual"/>
         </w:rPr>
       </w:pPr>
-      <w:hyperlink w:anchor="_Toc242714277" w:history="1">
+      <w:hyperlink w:anchor="_Toc242726566" w:history="1">
         <w:r>
           <w:rPr>
             <w:rStyle w:val="Hyperlink"/>
@@ -1434,7 +1443,7 @@
             <w:noProof/>
             <w:webHidden/>
           </w:rPr>
-          <w:instrText xml:space="preserve"> PAGEREF _Toc242714277 \h </w:instrText>
+          <w:instrText xml:space="preserve"> PAGEREF _Toc242726566 \h </w:instrText>
         </w:r>
         <w:r>
           <w:rPr>
@@ -1482,7 +1491,7 @@
           <w14:ligatures w14:val="standardContextual"/>
         </w:rPr>
       </w:pPr>
-      <w:hyperlink w:anchor="_Toc242714278" w:history="1">
+      <w:hyperlink w:anchor="_Toc242726567" w:history="1">
         <w:r>
           <w:rPr>
             <w:rStyle w:val="Hyperlink"/>
@@ -1509,7 +1518,7 @@
             <w:noProof/>
             <w:webHidden/>
           </w:rPr>
-          <w:instrText xml:space="preserve"> PAGEREF _Toc242714278 \h </w:instrText>
+          <w:instrText xml:space="preserve"> PAGEREF _Toc242726567 \h </w:instrText>
         </w:r>
         <w:r>
           <w:rPr>
@@ -1557,7 +1566,7 @@
           <w14:ligatures w14:val="standardContextual"/>
         </w:rPr>
       </w:pPr>
-      <w:hyperlink w:anchor="_Toc242714279" w:history="1">
+      <w:hyperlink w:anchor="_Toc242726568" w:history="1">
         <w:r>
           <w:rPr>
             <w:rStyle w:val="Hyperlink"/>
@@ -1584,7 +1593,7 @@
             <w:noProof/>
             <w:webHidden/>
           </w:rPr>
-          <w:instrText xml:space="preserve"> PAGEREF _Toc242714279 \h </w:instrText>
+          <w:instrText xml:space="preserve"> PAGEREF _Toc242726568 \h </w:instrText>
         </w:r>
         <w:r>
           <w:rPr>
@@ -1632,7 +1641,7 @@
           <w14:ligatures w14:val="standardContextual"/>
         </w:rPr>
       </w:pPr>
-      <w:hyperlink w:anchor="_Toc242714280" w:history="1">
+      <w:hyperlink w:anchor="_Toc242726569" w:history="1">
         <w:r>
           <w:rPr>
             <w:rStyle w:val="Hyperlink"/>
@@ -1659,7 +1668,7 @@
             <w:noProof/>
             <w:webHidden/>
           </w:rPr>
-          <w:instrText xml:space="preserve"> PAGEREF _Toc242714280 \h </w:instrText>
+          <w:instrText xml:space="preserve"> PAGEREF _Toc242726569 \h </w:instrText>
         </w:r>
         <w:r>
           <w:rPr>
@@ -1707,7 +1716,7 @@
           <w14:ligatures w14:val="standardContextual"/>
         </w:rPr>
       </w:pPr>
-      <w:hyperlink w:anchor="_Toc242714281" w:history="1">
+      <w:hyperlink w:anchor="_Toc242726570" w:history="1">
         <w:r>
           <w:rPr>
             <w:rStyle w:val="Hyperlink"/>
@@ -1734,7 +1743,7 @@
             <w:noProof/>
             <w:webHidden/>
           </w:rPr>
-          <w:instrText xml:space="preserve"> PAGEREF _Toc242714281 \h </w:instrText>
+          <w:instrText xml:space="preserve"> PAGEREF _Toc242726570 \h </w:instrText>
         </w:r>
         <w:r>
           <w:rPr>
@@ -1782,7 +1791,7 @@
           <w14:ligatures w14:val="standardContextual"/>
         </w:rPr>
       </w:pPr>
-      <w:hyperlink w:anchor="_Toc242714282" w:history="1">
+      <w:hyperlink w:anchor="_Toc242726571" w:history="1">
         <w:r>
           <w:rPr>
             <w:rStyle w:val="Hyperlink"/>
@@ -1809,7 +1818,7 @@
             <w:noProof/>
             <w:webHidden/>
           </w:rPr>
-          <w:instrText xml:space="preserve"> PAGEREF _Toc242714282 \h </w:instrText>
+          <w:instrText xml:space="preserve"> PAGEREF _Toc242726571 \h </w:instrText>
         </w:r>
         <w:r>
           <w:rPr>
@@ -1857,7 +1866,7 @@
           <w14:ligatures w14:val="standardContextual"/>
         </w:rPr>
       </w:pPr>
-      <w:hyperlink w:anchor="_Toc242714283" w:history="1">
+      <w:hyperlink w:anchor="_Toc242726572" w:history="1">
         <w:r>
           <w:rPr>
             <w:rStyle w:val="Hyperlink"/>
@@ -1884,7 +1893,7 @@
             <w:noProof/>
             <w:webHidden/>
           </w:rPr>
-          <w:instrText xml:space="preserve"> PAGEREF _Toc242714283 \h </w:instrText>
+          <w:instrText xml:space="preserve"> PAGEREF _Toc242726572 \h </w:instrText>
         </w:r>
         <w:r>
           <w:rPr>
@@ -1932,7 +1941,7 @@
           <w14:ligatures w14:val="standardContextual"/>
         </w:rPr>
       </w:pPr>
-      <w:hyperlink w:anchor="_Toc242714284" w:history="1">
+      <w:hyperlink w:anchor="_Toc242726573" w:history="1">
         <w:r>
           <w:rPr>
             <w:rStyle w:val="Hyperlink"/>
@@ -1959,7 +1968,7 @@
             <w:noProof/>
             <w:webHidden/>
           </w:rPr>
-          <w:instrText xml:space="preserve"> PAGEREF _Toc242714284 \h </w:instrText>
+          <w:instrText xml:space="preserve"> PAGEREF _Toc242726573 \h </w:instrText>
         </w:r>
         <w:r>
           <w:rPr>
@@ -2007,7 +2016,7 @@
           <w14:ligatures w14:val="standardContextual"/>
         </w:rPr>
       </w:pPr>
-      <w:hyperlink w:anchor="_Toc242714285" w:history="1">
+      <w:hyperlink w:anchor="_Toc242726574" w:history="1">
         <w:r>
           <w:rPr>
             <w:rStyle w:val="Hyperlink"/>
@@ -2034,7 +2043,7 @@
             <w:noProof/>
             <w:webHidden/>
           </w:rPr>
-          <w:instrText xml:space="preserve"> PAGEREF _Toc242714285 \h </w:instrText>
+          <w:instrText xml:space="preserve"> PAGEREF _Toc242726574 \h </w:instrText>
         </w:r>
         <w:r>
           <w:rPr>
@@ -2082,7 +2091,7 @@
           <w14:ligatures w14:val="standardContextual"/>
         </w:rPr>
       </w:pPr>
-      <w:hyperlink w:anchor="_Toc242714286" w:history="1">
+      <w:hyperlink w:anchor="_Toc242726575" w:history="1">
         <w:r>
           <w:rPr>
             <w:rStyle w:val="Hyperlink"/>
@@ -2109,7 +2118,7 @@
             <w:noProof/>
             <w:webHidden/>
           </w:rPr>
-          <w:instrText xml:space="preserve"> PAGEREF _Toc242714286 \h </w:instrText>
+          <w:instrText xml:space="preserve"> PAGEREF _Toc242726575 \h </w:instrText>
         </w:r>
         <w:r>
           <w:rPr>
@@ -2157,7 +2166,7 @@
           <w14:ligatures w14:val="standardContextual"/>
         </w:rPr>
       </w:pPr>
-      <w:hyperlink w:anchor="_Toc242714287" w:history="1">
+      <w:hyperlink w:anchor="_Toc242726576" w:history="1">
         <w:r>
           <w:rPr>
             <w:rStyle w:val="Hyperlink"/>
@@ -2184,7 +2193,7 @@
             <w:noProof/>
             <w:webHidden/>
           </w:rPr>
-          <w:instrText xml:space="preserve"> PAGEREF _Toc242714287 \h </w:instrText>
+          <w:instrText xml:space="preserve"> PAGEREF _Toc242726576 \h </w:instrText>
         </w:r>
         <w:r>
           <w:rPr>
@@ -2232,7 +2241,7 @@
           <w14:ligatures w14:val="standardContextual"/>
         </w:rPr>
       </w:pPr>
-      <w:hyperlink w:anchor="_Toc242714288" w:history="1">
+      <w:hyperlink w:anchor="_Toc242726577" w:history="1">
         <w:r>
           <w:rPr>
             <w:rStyle w:val="Hyperlink"/>
@@ -2259,7 +2268,7 @@
             <w:noProof/>
             <w:webHidden/>
           </w:rPr>
-          <w:instrText xml:space="preserve"> PAGEREF _Toc242714288 \h </w:instrText>
+          <w:instrText xml:space="preserve"> PAGEREF _Toc242726577 \h </w:instrText>
         </w:r>
         <w:r>
           <w:rPr>
@@ -2307,7 +2316,7 @@
           <w14:ligatures w14:val="standardContextual"/>
         </w:rPr>
       </w:pPr>
-      <w:hyperlink w:anchor="_Toc242714289" w:history="1">
+      <w:hyperlink w:anchor="_Toc242726578" w:history="1">
         <w:r>
           <w:rPr>
             <w:rStyle w:val="Hyperlink"/>
@@ -2334,7 +2343,7 @@
             <w:noProof/>
             <w:webHidden/>
           </w:rPr>
-          <w:instrText xml:space="preserve"> PAGEREF _Toc242714289 \h </w:instrText>
+          <w:instrText xml:space="preserve"> PAGEREF _Toc242726578 \h </w:instrText>
         </w:r>
         <w:r>
           <w:rPr>
@@ -2382,7 +2391,7 @@
           <w14:ligatures w14:val="standardContextual"/>
         </w:rPr>
       </w:pPr>
-      <w:hyperlink w:anchor="_Toc242714290" w:history="1">
+      <w:hyperlink w:anchor="_Toc242726579" w:history="1">
         <w:r>
           <w:rPr>
             <w:rStyle w:val="Hyperlink"/>
@@ -2409,7 +2418,7 @@
             <w:noProof/>
             <w:webHidden/>
           </w:rPr>
-          <w:instrText xml:space="preserve"> PAGEREF _Toc242714290 \h </w:instrText>
+          <w:instrText xml:space="preserve"> PAGEREF _Toc242726579 \h </w:instrText>
         </w:r>
         <w:r>
           <w:rPr>
@@ -2457,7 +2466,7 @@
           <w14:ligatures w14:val="standardContextual"/>
         </w:rPr>
       </w:pPr>
-      <w:hyperlink w:anchor="_Toc242714291" w:history="1">
+      <w:hyperlink w:anchor="_Toc242726580" w:history="1">
         <w:r>
           <w:rPr>
             <w:rStyle w:val="Hyperlink"/>
@@ -2484,7 +2493,7 @@
             <w:noProof/>
             <w:webHidden/>
           </w:rPr>
-          <w:instrText xml:space="preserve"> PAGEREF _Toc242714291 \h </w:instrText>
+          <w:instrText xml:space="preserve"> PAGEREF _Toc242726580 \h </w:instrText>
         </w:r>
         <w:r>
           <w:rPr>
@@ -2532,7 +2541,7 @@
           <w14:ligatures w14:val="standardContextual"/>
         </w:rPr>
       </w:pPr>
-      <w:hyperlink w:anchor="_Toc242714292" w:history="1">
+      <w:hyperlink w:anchor="_Toc242726581" w:history="1">
         <w:r>
           <w:rPr>
             <w:rStyle w:val="Hyperlink"/>
@@ -2559,7 +2568,7 @@
             <w:noProof/>
             <w:webHidden/>
           </w:rPr>
-          <w:instrText xml:space="preserve"> PAGEREF _Toc242714292 \h </w:instrText>
+          <w:instrText xml:space="preserve"> PAGEREF _Toc242726581 \h </w:instrText>
         </w:r>
         <w:r>
           <w:rPr>
@@ -2607,7 +2616,7 @@
           <w14:ligatures w14:val="standardContextual"/>
         </w:rPr>
       </w:pPr>
-      <w:hyperlink w:anchor="_Toc242714293" w:history="1">
+      <w:hyperlink w:anchor="_Toc242726582" w:history="1">
         <w:r>
           <w:rPr>
             <w:rStyle w:val="Hyperlink"/>
@@ -2634,7 +2643,7 @@
             <w:noProof/>
             <w:webHidden/>
           </w:rPr>
-          <w:instrText xml:space="preserve"> PAGEREF _Toc242714293 \h </w:instrText>
+          <w:instrText xml:space="preserve"> PAGEREF _Toc242726582 \h </w:instrText>
         </w:r>
         <w:r>
           <w:rPr>
@@ -2682,7 +2691,7 @@
           <w14:ligatures w14:val="standardContextual"/>
         </w:rPr>
       </w:pPr>
-      <w:hyperlink w:anchor="_Toc242714294" w:history="1">
+      <w:hyperlink w:anchor="_Toc242726583" w:history="1">
         <w:r>
           <w:rPr>
             <w:rStyle w:val="Hyperlink"/>
@@ -2709,7 +2718,7 @@
             <w:noProof/>
             <w:webHidden/>
           </w:rPr>
-          <w:instrText xml:space="preserve"> PAGEREF _Toc242714294 \h </w:instrText>
+          <w:instrText xml:space="preserve"> PAGEREF _Toc242726583 \h </w:instrText>
         </w:r>
         <w:r>
           <w:rPr>
@@ -2757,7 +2766,7 @@
           <w14:ligatures w14:val="standardContextual"/>
         </w:rPr>
       </w:pPr>
-      <w:hyperlink w:anchor="_Toc242714295" w:history="1">
+      <w:hyperlink w:anchor="_Toc242726584" w:history="1">
         <w:r>
           <w:rPr>
             <w:rStyle w:val="Hyperlink"/>
@@ -2784,7 +2793,7 @@
             <w:noProof/>
             <w:webHidden/>
           </w:rPr>
-          <w:instrText xml:space="preserve"> PAGEREF _Toc242714295 \h </w:instrText>
+          <w:instrText xml:space="preserve"> PAGEREF _Toc242726584 \h </w:instrText>
         </w:r>
         <w:r>
           <w:rPr>
@@ -2832,7 +2841,7 @@
           <w14:ligatures w14:val="standardContextual"/>
         </w:rPr>
       </w:pPr>
-      <w:hyperlink w:anchor="_Toc242714296" w:history="1">
+      <w:hyperlink w:anchor="_Toc242726585" w:history="1">
         <w:r>
           <w:rPr>
             <w:rStyle w:val="Hyperlink"/>
@@ -2859,7 +2868,7 @@
             <w:noProof/>
             <w:webHidden/>
           </w:rPr>
-          <w:instrText xml:space="preserve"> PAGEREF _Toc242714296 \h </w:instrText>
+          <w:instrText xml:space="preserve"> PAGEREF _Toc242726585 \h </w:instrText>
         </w:r>
         <w:r>
           <w:rPr>
@@ -2907,7 +2916,7 @@
           <w14:ligatures w14:val="standardContextual"/>
         </w:rPr>
       </w:pPr>
-      <w:hyperlink w:anchor="_Toc242714297" w:history="1">
+      <w:hyperlink w:anchor="_Toc242726586" w:history="1">
         <w:r>
           <w:rPr>
             <w:rStyle w:val="Hyperlink"/>
@@ -2934,7 +2943,7 @@
             <w:noProof/>
             <w:webHidden/>
           </w:rPr>
-          <w:instrText xml:space="preserve"> PAGEREF _Toc242714297 \h </w:instrText>
+          <w:instrText xml:space="preserve"> PAGEREF _Toc242726586 \h </w:instrText>
         </w:r>
         <w:r>
           <w:rPr>
@@ -2982,7 +2991,7 @@
           <w14:ligatures w14:val="standardContextual"/>
         </w:rPr>
       </w:pPr>
-      <w:hyperlink w:anchor="_Toc242714298" w:history="1">
+      <w:hyperlink w:anchor="_Toc242726587" w:history="1">
         <w:r>
           <w:rPr>
             <w:rStyle w:val="Hyperlink"/>
@@ -3009,7 +3018,7 @@
             <w:noProof/>
             <w:webHidden/>
           </w:rPr>
-          <w:instrText xml:space="preserve"> PAGEREF _Toc242714298 \h </w:instrText>
+          <w:instrText xml:space="preserve"> PAGEREF _Toc242726587 \h </w:instrText>
         </w:r>
         <w:r>
           <w:rPr>
@@ -3057,7 +3066,7 @@
           <w14:ligatures w14:val="standardContextual"/>
         </w:rPr>
       </w:pPr>
-      <w:hyperlink w:anchor="_Toc242714299" w:history="1">
+      <w:hyperlink w:anchor="_Toc242726588" w:history="1">
         <w:r>
           <w:rPr>
             <w:rStyle w:val="Hyperlink"/>
@@ -3084,7 +3093,7 @@
             <w:noProof/>
             <w:webHidden/>
           </w:rPr>
-          <w:instrText xml:space="preserve"> PAGEREF _Toc242714299 \h </w:instrText>
+          <w:instrText xml:space="preserve"> PAGEREF _Toc242726588 \h </w:instrText>
         </w:r>
         <w:r>
           <w:rPr>
@@ -3132,7 +3141,7 @@
           <w14:ligatures w14:val="standardContextual"/>
         </w:rPr>
       </w:pPr>
-      <w:hyperlink w:anchor="_Toc242714300" w:history="1">
+      <w:hyperlink w:anchor="_Toc242726589" w:history="1">
         <w:r>
           <w:rPr>
             <w:rStyle w:val="Hyperlink"/>
@@ -3159,7 +3168,7 @@
             <w:noProof/>
             <w:webHidden/>
           </w:rPr>
-          <w:instrText xml:space="preserve"> PAGEREF _Toc242714300 \h </w:instrText>
+          <w:instrText xml:space="preserve"> PAGEREF _Toc242726589 \h </w:instrText>
         </w:r>
         <w:r>
           <w:rPr>
@@ -3207,7 +3216,7 @@
           <w14:ligatures w14:val="standardContextual"/>
         </w:rPr>
       </w:pPr>
-      <w:hyperlink w:anchor="_Toc242714301" w:history="1">
+      <w:hyperlink w:anchor="_Toc242726590" w:history="1">
         <w:r>
           <w:rPr>
             <w:rStyle w:val="Hyperlink"/>
@@ -3234,7 +3243,7 @@
             <w:noProof/>
             <w:webHidden/>
           </w:rPr>
-          <w:instrText xml:space="preserve"> PAGEREF _Toc242714301 \h </w:instrText>
+          <w:instrText xml:space="preserve"> PAGEREF _Toc242726590 \h </w:instrText>
         </w:r>
         <w:r>
           <w:rPr>
@@ -3282,7 +3291,7 @@
           <w14:ligatures w14:val="standardContextual"/>
         </w:rPr>
       </w:pPr>
-      <w:hyperlink w:anchor="_Toc242714302" w:history="1">
+      <w:hyperlink w:anchor="_Toc242726591" w:history="1">
         <w:r>
           <w:rPr>
             <w:rStyle w:val="Hyperlink"/>
@@ -3309,7 +3318,7 @@
             <w:noProof/>
             <w:webHidden/>
           </w:rPr>
-          <w:instrText xml:space="preserve"> PAGEREF _Toc242714302 \h </w:instrText>
+          <w:instrText xml:space="preserve"> PAGEREF _Toc242726591 \h </w:instrText>
         </w:r>
         <w:r>
           <w:rPr>
@@ -3357,7 +3366,7 @@
           <w14:ligatures w14:val="standardContextual"/>
         </w:rPr>
       </w:pPr>
-      <w:hyperlink w:anchor="_Toc242714303" w:history="1">
+      <w:hyperlink w:anchor="_Toc242726592" w:history="1">
         <w:r>
           <w:rPr>
             <w:rStyle w:val="Hyperlink"/>
@@ -3384,7 +3393,7 @@
             <w:noProof/>
             <w:webHidden/>
           </w:rPr>
-          <w:instrText xml:space="preserve"> PAGEREF _Toc242714303 \h </w:instrText>
+          <w:instrText xml:space="preserve"> PAGEREF _Toc242726592 \h </w:instrText>
         </w:r>
         <w:r>
           <w:rPr>
@@ -3432,7 +3441,7 @@
           <w14:ligatures w14:val="standardContextual"/>
         </w:rPr>
       </w:pPr>
-      <w:hyperlink w:anchor="_Toc242714304" w:history="1">
+      <w:hyperlink w:anchor="_Toc242726593" w:history="1">
         <w:r>
           <w:rPr>
             <w:rStyle w:val="Hyperlink"/>
@@ -3459,7 +3468,7 @@
             <w:noProof/>
             <w:webHidden/>
           </w:rPr>
-          <w:instrText xml:space="preserve"> PAGEREF _Toc242714304 \h </w:instrText>
+          <w:instrText xml:space="preserve"> PAGEREF _Toc242726593 \h </w:instrText>
         </w:r>
         <w:r>
           <w:rPr>
@@ -3507,7 +3516,7 @@
           <w14:ligatures w14:val="standardContextual"/>
         </w:rPr>
       </w:pPr>
-      <w:hyperlink w:anchor="_Toc242714305" w:history="1">
+      <w:hyperlink w:anchor="_Toc242726594" w:history="1">
         <w:r>
           <w:rPr>
             <w:rStyle w:val="Hyperlink"/>
@@ -3534,7 +3543,7 @@
             <w:noProof/>
             <w:webHidden/>
           </w:rPr>
-          <w:instrText xml:space="preserve"> PAGEREF _Toc242714305 \h </w:instrText>
+          <w:instrText xml:space="preserve"> PAGEREF _Toc242726594 \h </w:instrText>
         </w:r>
         <w:r>
           <w:rPr>
@@ -3582,7 +3591,7 @@
           <w14:ligatures w14:val="standardContextual"/>
         </w:rPr>
       </w:pPr>
-      <w:hyperlink w:anchor="_Toc242714306" w:history="1">
+      <w:hyperlink w:anchor="_Toc242726595" w:history="1">
         <w:r>
           <w:rPr>
             <w:rStyle w:val="Hyperlink"/>
@@ -3609,7 +3618,7 @@
             <w:noProof/>
             <w:webHidden/>
           </w:rPr>
-          <w:instrText xml:space="preserve"> PAGEREF _Toc242714306 \h </w:instrText>
+          <w:instrText xml:space="preserve"> PAGEREF _Toc242726595 \h </w:instrText>
         </w:r>
         <w:r>
           <w:rPr>
@@ -3657,7 +3666,7 @@
           <w14:ligatures w14:val="standardContextual"/>
         </w:rPr>
       </w:pPr>
-      <w:hyperlink w:anchor="_Toc242714307" w:history="1">
+      <w:hyperlink w:anchor="_Toc242726596" w:history="1">
         <w:r>
           <w:rPr>
             <w:rStyle w:val="Hyperlink"/>
@@ -3684,7 +3693,7 @@
             <w:noProof/>
             <w:webHidden/>
           </w:rPr>
-          <w:instrText xml:space="preserve"> PAGEREF _Toc242714307 \h </w:instrText>
+          <w:instrText xml:space="preserve"> PAGEREF _Toc242726596 \h </w:instrText>
         </w:r>
         <w:r>
           <w:rPr>
@@ -3732,7 +3741,7 @@
           <w14:ligatures w14:val="standardContextual"/>
         </w:rPr>
       </w:pPr>
-      <w:hyperlink w:anchor="_Toc242714308" w:history="1">
+      <w:hyperlink w:anchor="_Toc242726597" w:history="1">
         <w:r>
           <w:rPr>
             <w:rStyle w:val="Hyperlink"/>
@@ -3759,7 +3768,7 @@
             <w:noProof/>
             <w:webHidden/>
           </w:rPr>
-          <w:instrText xml:space="preserve"> PAGEREF _Toc242714308 \h </w:instrText>
+          <w:instrText xml:space="preserve"> PAGEREF _Toc242726597 \h </w:instrText>
         </w:r>
         <w:r>
           <w:rPr>
@@ -3807,7 +3816,7 @@
           <w14:ligatures w14:val="standardContextual"/>
         </w:rPr>
       </w:pPr>
-      <w:hyperlink w:anchor="_Toc242714309" w:history="1">
+      <w:hyperlink w:anchor="_Toc242726598" w:history="1">
         <w:r>
           <w:rPr>
             <w:rStyle w:val="Hyperlink"/>
@@ -3834,7 +3843,7 @@
             <w:noProof/>
             <w:webHidden/>
           </w:rPr>
-          <w:instrText xml:space="preserve"> PAGEREF _Toc242714309 \h </w:instrText>
+          <w:instrText xml:space="preserve"> PAGEREF _Toc242726598 \h </w:instrText>
         </w:r>
         <w:r>
           <w:rPr>
@@ -3882,7 +3891,7 @@
           <w14:ligatures w14:val="standardContextual"/>
         </w:rPr>
       </w:pPr>
-      <w:hyperlink w:anchor="_Toc242714310" w:history="1">
+      <w:hyperlink w:anchor="_Toc242726599" w:history="1">
         <w:r>
           <w:rPr>
             <w:rStyle w:val="Hyperlink"/>
@@ -3909,7 +3918,7 @@
             <w:noProof/>
             <w:webHidden/>
           </w:rPr>
-          <w:instrText xml:space="preserve"> PAGEREF _Toc242714310 \h </w:instrText>
+          <w:instrText xml:space="preserve"> PAGEREF _Toc242726599 \h </w:instrText>
         </w:r>
         <w:r>
           <w:rPr>
@@ -3957,7 +3966,7 @@
           <w14:ligatures w14:val="standardContextual"/>
         </w:rPr>
       </w:pPr>
-      <w:hyperlink w:anchor="_Toc242714311" w:history="1">
+      <w:hyperlink w:anchor="_Toc242726600" w:history="1">
         <w:r>
           <w:rPr>
             <w:rStyle w:val="Hyperlink"/>
@@ -3984,7 +3993,7 @@
             <w:noProof/>
             <w:webHidden/>
           </w:rPr>
-          <w:instrText xml:space="preserve"> PAGEREF _Toc242714311 \h </w:instrText>
+          <w:instrText xml:space="preserve"> PAGEREF _Toc242726600 \h </w:instrText>
         </w:r>
         <w:r>
           <w:rPr>
@@ -4032,7 +4041,7 @@
           <w14:ligatures w14:val="standardContextual"/>
         </w:rPr>
       </w:pPr>
-      <w:hyperlink w:anchor="_Toc242714312" w:history="1">
+      <w:hyperlink w:anchor="_Toc242726601" w:history="1">
         <w:r>
           <w:rPr>
             <w:rStyle w:val="Hyperlink"/>
@@ -4059,7 +4068,7 @@
             <w:noProof/>
             <w:webHidden/>
           </w:rPr>
-          <w:instrText xml:space="preserve"> PAGEREF _Toc242714312 \h </w:instrText>
+          <w:instrText xml:space="preserve"> PAGEREF _Toc242726601 \h </w:instrText>
         </w:r>
         <w:r>
           <w:rPr>
@@ -4107,7 +4116,7 @@
           <w14:ligatures w14:val="standardContextual"/>
         </w:rPr>
       </w:pPr>
-      <w:hyperlink w:anchor="_Toc242714313" w:history="1">
+      <w:hyperlink w:anchor="_Toc242726602" w:history="1">
         <w:r>
           <w:rPr>
             <w:rStyle w:val="Hyperlink"/>
@@ -4134,7 +4143,7 @@
             <w:noProof/>
             <w:webHidden/>
           </w:rPr>
-          <w:instrText xml:space="preserve"> PAGEREF _Toc242714313 \h </w:instrText>
+          <w:instrText xml:space="preserve"> PAGEREF _Toc242726602 \h </w:instrText>
         </w:r>
         <w:r>
           <w:rPr>
@@ -4182,7 +4191,7 @@
           <w14:ligatures w14:val="standardContextual"/>
         </w:rPr>
       </w:pPr>
-      <w:hyperlink w:anchor="_Toc242714314" w:history="1">
+      <w:hyperlink w:anchor="_Toc242726603" w:history="1">
         <w:r>
           <w:rPr>
             <w:rStyle w:val="Hyperlink"/>
@@ -4209,7 +4218,7 @@
             <w:noProof/>
             <w:webHidden/>
           </w:rPr>
-          <w:instrText xml:space="preserve"> PAGEREF _Toc242714314 \h </w:instrText>
+          <w:instrText xml:space="preserve"> PAGEREF _Toc242726603 \h </w:instrText>
         </w:r>
         <w:r>
           <w:rPr>
@@ -4257,7 +4266,7 @@
           <w14:ligatures w14:val="standardContextual"/>
         </w:rPr>
       </w:pPr>
-      <w:hyperlink w:anchor="_Toc242714315" w:history="1">
+      <w:hyperlink w:anchor="_Toc242726604" w:history="1">
         <w:r>
           <w:rPr>
             <w:rStyle w:val="Hyperlink"/>
@@ -4284,7 +4293,7 @@
             <w:noProof/>
             <w:webHidden/>
           </w:rPr>
-          <w:instrText xml:space="preserve"> PAGEREF _Toc242714315 \h </w:instrText>
+          <w:instrText xml:space="preserve"> PAGEREF _Toc242726604 \h </w:instrText>
         </w:r>
         <w:r>
           <w:rPr>
@@ -4332,7 +4341,7 @@
           <w14:ligatures w14:val="standardContextual"/>
         </w:rPr>
       </w:pPr>
-      <w:hyperlink w:anchor="_Toc242714316" w:history="1">
+      <w:hyperlink w:anchor="_Toc242726605" w:history="1">
         <w:r>
           <w:rPr>
             <w:rStyle w:val="Hyperlink"/>
@@ -4359,7 +4368,7 @@
             <w:noProof/>
             <w:webHidden/>
           </w:rPr>
-          <w:instrText xml:space="preserve"> PAGEREF _Toc242714316 \h </w:instrText>
+          <w:instrText xml:space="preserve"> PAGEREF _Toc242726605 \h </w:instrText>
         </w:r>
         <w:r>
           <w:rPr>
@@ -4407,7 +4416,7 @@
           <w14:ligatures w14:val="standardContextual"/>
         </w:rPr>
       </w:pPr>
-      <w:hyperlink w:anchor="_Toc242714317" w:history="1">
+      <w:hyperlink w:anchor="_Toc242726606" w:history="1">
         <w:r>
           <w:rPr>
             <w:rStyle w:val="Hyperlink"/>
@@ -4434,7 +4443,7 @@
             <w:noProof/>
             <w:webHidden/>
           </w:rPr>
-          <w:instrText xml:space="preserve"> PAGEREF _Toc242714317 \h </w:instrText>
+          <w:instrText xml:space="preserve"> PAGEREF _Toc242726606 \h </w:instrText>
         </w:r>
         <w:r>
           <w:rPr>
@@ -4482,7 +4491,7 @@
           <w14:ligatures w14:val="standardContextual"/>
         </w:rPr>
       </w:pPr>
-      <w:hyperlink w:anchor="_Toc242714318" w:history="1">
+      <w:hyperlink w:anchor="_Toc242726607" w:history="1">
         <w:r>
           <w:rPr>
             <w:rStyle w:val="Hyperlink"/>
@@ -4509,7 +4518,7 @@
             <w:noProof/>
             <w:webHidden/>
           </w:rPr>
-          <w:instrText xml:space="preserve"> PAGEREF _Toc242714318 \h </w:instrText>
+          <w:instrText xml:space="preserve"> PAGEREF _Toc242726607 \h </w:instrText>
         </w:r>
         <w:r>
           <w:rPr>
@@ -4557,7 +4566,7 @@
           <w14:ligatures w14:val="standardContextual"/>
         </w:rPr>
       </w:pPr>
-      <w:hyperlink w:anchor="_Toc242714319" w:history="1">
+      <w:hyperlink w:anchor="_Toc242726608" w:history="1">
         <w:r>
           <w:rPr>
             <w:rStyle w:val="Hyperlink"/>
@@ -4584,7 +4593,7 @@
             <w:noProof/>
             <w:webHidden/>
           </w:rPr>
-          <w:instrText xml:space="preserve"> PAGEREF _Toc242714319 \h </w:instrText>
+          <w:instrText xml:space="preserve"> PAGEREF _Toc242726608 \h </w:instrText>
         </w:r>
         <w:r>
           <w:rPr>
@@ -4659,7 +4668,7 @@
       <w:r>
         <w:fldChar w:fldCharType="separate"/>
       </w:r>
-      <w:hyperlink w:anchor="_Toc242714320" w:history="1">
+      <w:hyperlink w:anchor="_Toc242726609" w:history="1">
         <w:r>
           <w:rPr>
             <w:rStyle w:val="Hyperlink"/>
@@ -4694,7 +4703,7 @@
             <w:noProof/>
             <w:webHidden/>
           </w:rPr>
-          <w:instrText xml:space="preserve"> PAGEREF _Toc242714320 \h </w:instrText>
+          <w:instrText xml:space="preserve"> PAGEREF _Toc242726609 \h </w:instrText>
         </w:r>
         <w:r>
           <w:rPr>
@@ -4742,7 +4751,7 @@
           <w14:ligatures w14:val="standardContextual"/>
         </w:rPr>
       </w:pPr>
-      <w:hyperlink w:anchor="_Toc242714321" w:history="1">
+      <w:hyperlink w:anchor="_Toc242726610" w:history="1">
         <w:r>
           <w:rPr>
             <w:rStyle w:val="Hyperlink"/>
@@ -4777,7 +4786,7 @@
             <w:noProof/>
             <w:webHidden/>
           </w:rPr>
-          <w:instrText xml:space="preserve"> PAGEREF _Toc242714321 \h </w:instrText>
+          <w:instrText xml:space="preserve"> PAGEREF _Toc242726610 \h </w:instrText>
         </w:r>
         <w:r>
           <w:rPr>
@@ -4825,7 +4834,7 @@
           <w14:ligatures w14:val="standardContextual"/>
         </w:rPr>
       </w:pPr>
-      <w:hyperlink w:anchor="_Toc242714322" w:history="1">
+      <w:hyperlink w:anchor="_Toc242726611" w:history="1">
         <w:r>
           <w:rPr>
             <w:rStyle w:val="Hyperlink"/>
@@ -4860,7 +4869,7 @@
             <w:noProof/>
             <w:webHidden/>
           </w:rPr>
-          <w:instrText xml:space="preserve"> PAGEREF _Toc242714322 \h </w:instrText>
+          <w:instrText xml:space="preserve"> PAGEREF _Toc242726611 \h </w:instrText>
         </w:r>
         <w:r>
           <w:rPr>
@@ -4908,7 +4917,7 @@
           <w14:ligatures w14:val="standardContextual"/>
         </w:rPr>
       </w:pPr>
-      <w:hyperlink w:anchor="_Toc242714323" w:history="1">
+      <w:hyperlink w:anchor="_Toc242726612" w:history="1">
         <w:r>
           <w:rPr>
             <w:rStyle w:val="Hyperlink"/>
@@ -4943,7 +4952,7 @@
             <w:noProof/>
             <w:webHidden/>
           </w:rPr>
-          <w:instrText xml:space="preserve"> PAGEREF _Toc242714323 \h </w:instrText>
+          <w:instrText xml:space="preserve"> PAGEREF _Toc242726612 \h </w:instrText>
         </w:r>
         <w:r>
           <w:rPr>
@@ -4991,7 +5000,7 @@
           <w14:ligatures w14:val="standardContextual"/>
         </w:rPr>
       </w:pPr>
-      <w:hyperlink w:anchor="_Toc242714324" w:history="1">
+      <w:hyperlink w:anchor="_Toc242726613" w:history="1">
         <w:r>
           <w:rPr>
             <w:rStyle w:val="Hyperlink"/>
@@ -5026,7 +5035,7 @@
             <w:noProof/>
             <w:webHidden/>
           </w:rPr>
-          <w:instrText xml:space="preserve"> PAGEREF _Toc242714324 \h </w:instrText>
+          <w:instrText xml:space="preserve"> PAGEREF _Toc242726613 \h </w:instrText>
         </w:r>
         <w:r>
           <w:rPr>
@@ -5074,7 +5083,7 @@
           <w14:ligatures w14:val="standardContextual"/>
         </w:rPr>
       </w:pPr>
-      <w:hyperlink w:anchor="_Toc242714325" w:history="1">
+      <w:hyperlink w:anchor="_Toc242726614" w:history="1">
         <w:r>
           <w:rPr>
             <w:rStyle w:val="Hyperlink"/>
@@ -5109,7 +5118,7 @@
             <w:noProof/>
             <w:webHidden/>
           </w:rPr>
-          <w:instrText xml:space="preserve"> PAGEREF _Toc242714325 \h </w:instrText>
+          <w:instrText xml:space="preserve"> PAGEREF _Toc242726614 \h </w:instrText>
         </w:r>
         <w:r>
           <w:rPr>
@@ -5157,7 +5166,7 @@
           <w14:ligatures w14:val="standardContextual"/>
         </w:rPr>
       </w:pPr>
-      <w:hyperlink w:anchor="_Toc242714326" w:history="1">
+      <w:hyperlink w:anchor="_Toc242726615" w:history="1">
         <w:r>
           <w:rPr>
             <w:rStyle w:val="Hyperlink"/>
@@ -5192,7 +5201,7 @@
             <w:noProof/>
             <w:webHidden/>
           </w:rPr>
-          <w:instrText xml:space="preserve"> PAGEREF _Toc242714326 \h </w:instrText>
+          <w:instrText xml:space="preserve"> PAGEREF _Toc242726615 \h </w:instrText>
         </w:r>
         <w:r>
           <w:rPr>
@@ -5240,7 +5249,7 @@
           <w14:ligatures w14:val="standardContextual"/>
         </w:rPr>
       </w:pPr>
-      <w:hyperlink w:anchor="_Toc242714327" w:history="1">
+      <w:hyperlink w:anchor="_Toc242726616" w:history="1">
         <w:r>
           <w:rPr>
             <w:rStyle w:val="Hyperlink"/>
@@ -5275,7 +5284,7 @@
             <w:noProof/>
             <w:webHidden/>
           </w:rPr>
-          <w:instrText xml:space="preserve"> PAGEREF _Toc242714327 \h </w:instrText>
+          <w:instrText xml:space="preserve"> PAGEREF _Toc242726616 \h </w:instrText>
         </w:r>
         <w:r>
           <w:rPr>
@@ -5323,7 +5332,7 @@
           <w14:ligatures w14:val="standardContextual"/>
         </w:rPr>
       </w:pPr>
-      <w:hyperlink w:anchor="_Toc242714328" w:history="1">
+      <w:hyperlink w:anchor="_Toc242726617" w:history="1">
         <w:r>
           <w:rPr>
             <w:rStyle w:val="Hyperlink"/>
@@ -5358,7 +5367,7 @@
             <w:noProof/>
             <w:webHidden/>
           </w:rPr>
-          <w:instrText xml:space="preserve"> PAGEREF _Toc242714328 \h </w:instrText>
+          <w:instrText xml:space="preserve"> PAGEREF _Toc242726617 \h </w:instrText>
         </w:r>
         <w:r>
           <w:rPr>
@@ -5406,7 +5415,7 @@
           <w14:ligatures w14:val="standardContextual"/>
         </w:rPr>
       </w:pPr>
-      <w:hyperlink w:anchor="_Toc242714329" w:history="1">
+      <w:hyperlink w:anchor="_Toc242726618" w:history="1">
         <w:r>
           <w:rPr>
             <w:rStyle w:val="Hyperlink"/>
@@ -5441,7 +5450,7 @@
             <w:noProof/>
             <w:webHidden/>
           </w:rPr>
-          <w:instrText xml:space="preserve"> PAGEREF _Toc242714329 \h </w:instrText>
+          <w:instrText xml:space="preserve"> PAGEREF _Toc242726618 \h </w:instrText>
         </w:r>
         <w:r>
           <w:rPr>
@@ -5489,7 +5498,7 @@
           <w14:ligatures w14:val="standardContextual"/>
         </w:rPr>
       </w:pPr>
-      <w:hyperlink w:anchor="_Toc242714330" w:history="1">
+      <w:hyperlink w:anchor="_Toc242726619" w:history="1">
         <w:r>
           <w:rPr>
             <w:rStyle w:val="Hyperlink"/>
@@ -5524,7 +5533,7 @@
             <w:noProof/>
             <w:webHidden/>
           </w:rPr>
-          <w:instrText xml:space="preserve"> PAGEREF _Toc242714330 \h </w:instrText>
+          <w:instrText xml:space="preserve"> PAGEREF _Toc242726619 \h </w:instrText>
         </w:r>
         <w:r>
           <w:rPr>
@@ -5572,7 +5581,7 @@
           <w14:ligatures w14:val="standardContextual"/>
         </w:rPr>
       </w:pPr>
-      <w:hyperlink w:anchor="_Toc242714331" w:history="1">
+      <w:hyperlink w:anchor="_Toc242726620" w:history="1">
         <w:r>
           <w:rPr>
             <w:rStyle w:val="Hyperlink"/>
@@ -5607,7 +5616,7 @@
             <w:noProof/>
             <w:webHidden/>
           </w:rPr>
-          <w:instrText xml:space="preserve"> PAGEREF _Toc242714331 \h </w:instrText>
+          <w:instrText xml:space="preserve"> PAGEREF _Toc242726620 \h </w:instrText>
         </w:r>
         <w:r>
           <w:rPr>
@@ -5655,7 +5664,7 @@
           <w14:ligatures w14:val="standardContextual"/>
         </w:rPr>
       </w:pPr>
-      <w:hyperlink w:anchor="_Toc242714332" w:history="1">
+      <w:hyperlink w:anchor="_Toc242726621" w:history="1">
         <w:r>
           <w:rPr>
             <w:rStyle w:val="Hyperlink"/>
@@ -5690,7 +5699,7 @@
             <w:noProof/>
             <w:webHidden/>
           </w:rPr>
-          <w:instrText xml:space="preserve"> PAGEREF _Toc242714332 \h </w:instrText>
+          <w:instrText xml:space="preserve"> PAGEREF _Toc242726621 \h </w:instrText>
         </w:r>
         <w:r>
           <w:rPr>
@@ -5738,7 +5747,7 @@
           <w14:ligatures w14:val="standardContextual"/>
         </w:rPr>
       </w:pPr>
-      <w:hyperlink w:anchor="_Toc242714333" w:history="1">
+      <w:hyperlink w:anchor="_Toc242726622" w:history="1">
         <w:r>
           <w:rPr>
             <w:rStyle w:val="Hyperlink"/>
@@ -5773,7 +5782,7 @@
             <w:noProof/>
             <w:webHidden/>
           </w:rPr>
-          <w:instrText xml:space="preserve"> PAGEREF _Toc242714333 \h </w:instrText>
+          <w:instrText xml:space="preserve"> PAGEREF _Toc242726622 \h </w:instrText>
         </w:r>
         <w:r>
           <w:rPr>
@@ -5821,7 +5830,7 @@
           <w14:ligatures w14:val="standardContextual"/>
         </w:rPr>
       </w:pPr>
-      <w:hyperlink w:anchor="_Toc242714334" w:history="1">
+      <w:hyperlink w:anchor="_Toc242726623" w:history="1">
         <w:r>
           <w:rPr>
             <w:rStyle w:val="Hyperlink"/>
@@ -5856,7 +5865,7 @@
             <w:noProof/>
             <w:webHidden/>
           </w:rPr>
-          <w:instrText xml:space="preserve"> PAGEREF _Toc242714334 \h </w:instrText>
+          <w:instrText xml:space="preserve"> PAGEREF _Toc242726623 \h </w:instrText>
         </w:r>
         <w:r>
           <w:rPr>
@@ -5904,7 +5913,7 @@
           <w14:ligatures w14:val="standardContextual"/>
         </w:rPr>
       </w:pPr>
-      <w:hyperlink w:anchor="_Toc242714335" w:history="1">
+      <w:hyperlink w:anchor="_Toc242726624" w:history="1">
         <w:r>
           <w:rPr>
             <w:rStyle w:val="Hyperlink"/>
@@ -5939,7 +5948,7 @@
             <w:noProof/>
             <w:webHidden/>
           </w:rPr>
-          <w:instrText xml:space="preserve"> PAGEREF _Toc242714335 \h </w:instrText>
+          <w:instrText xml:space="preserve"> PAGEREF _Toc242726624 \h </w:instrText>
         </w:r>
         <w:r>
           <w:rPr>
@@ -5987,7 +5996,7 @@
           <w14:ligatures w14:val="standardContextual"/>
         </w:rPr>
       </w:pPr>
-      <w:hyperlink w:anchor="_Toc242714336" w:history="1">
+      <w:hyperlink w:anchor="_Toc242726625" w:history="1">
         <w:r>
           <w:rPr>
             <w:rStyle w:val="Hyperlink"/>
@@ -6022,7 +6031,7 @@
             <w:noProof/>
             <w:webHidden/>
           </w:rPr>
-          <w:instrText xml:space="preserve"> PAGEREF _Toc242714336 \h </w:instrText>
+          <w:instrText xml:space="preserve"> PAGEREF _Toc242726625 \h </w:instrText>
         </w:r>
         <w:r>
           <w:rPr>
@@ -6070,7 +6079,7 @@
           <w14:ligatures w14:val="standardContextual"/>
         </w:rPr>
       </w:pPr>
-      <w:hyperlink w:anchor="_Toc242714337" w:history="1">
+      <w:hyperlink w:anchor="_Toc242726626" w:history="1">
         <w:r>
           <w:rPr>
             <w:rStyle w:val="Hyperlink"/>
@@ -6105,7 +6114,7 @@
             <w:noProof/>
             <w:webHidden/>
           </w:rPr>
-          <w:instrText xml:space="preserve"> PAGEREF _Toc242714337 \h </w:instrText>
+          <w:instrText xml:space="preserve"> PAGEREF _Toc242726626 \h </w:instrText>
         </w:r>
         <w:r>
           <w:rPr>
@@ -6153,7 +6162,7 @@
           <w14:ligatures w14:val="standardContextual"/>
         </w:rPr>
       </w:pPr>
-      <w:hyperlink w:anchor="_Toc242714338" w:history="1">
+      <w:hyperlink w:anchor="_Toc242726627" w:history="1">
         <w:r>
           <w:rPr>
             <w:rStyle w:val="Hyperlink"/>
@@ -6188,7 +6197,7 @@
             <w:noProof/>
             <w:webHidden/>
           </w:rPr>
-          <w:instrText xml:space="preserve"> PAGEREF _Toc242714338 \h </w:instrText>
+          <w:instrText xml:space="preserve"> PAGEREF _Toc242726627 \h </w:instrText>
         </w:r>
         <w:r>
           <w:rPr>
@@ -6236,7 +6245,7 @@
           <w14:ligatures w14:val="standardContextual"/>
         </w:rPr>
       </w:pPr>
-      <w:hyperlink w:anchor="_Toc242714339" w:history="1">
+      <w:hyperlink w:anchor="_Toc242726628" w:history="1">
         <w:r>
           <w:rPr>
             <w:rStyle w:val="Hyperlink"/>
@@ -6271,7 +6280,7 @@
             <w:noProof/>
             <w:webHidden/>
           </w:rPr>
-          <w:instrText xml:space="preserve"> PAGEREF _Toc242714339 \h </w:instrText>
+          <w:instrText xml:space="preserve"> PAGEREF _Toc242726628 \h </w:instrText>
         </w:r>
         <w:r>
           <w:rPr>
@@ -6319,7 +6328,7 @@
           <w14:ligatures w14:val="standardContextual"/>
         </w:rPr>
       </w:pPr>
-      <w:hyperlink w:anchor="_Toc242714340" w:history="1">
+      <w:hyperlink w:anchor="_Toc242726629" w:history="1">
         <w:r>
           <w:rPr>
             <w:rStyle w:val="Hyperlink"/>
@@ -6354,7 +6363,7 @@
             <w:noProof/>
             <w:webHidden/>
           </w:rPr>
-          <w:instrText xml:space="preserve"> PAGEREF _Toc242714340 \h </w:instrText>
+          <w:instrText xml:space="preserve"> PAGEREF _Toc242726629 \h </w:instrText>
         </w:r>
         <w:r>
           <w:rPr>
@@ -6402,7 +6411,7 @@
           <w14:ligatures w14:val="standardContextual"/>
         </w:rPr>
       </w:pPr>
-      <w:hyperlink w:anchor="_Toc242714341" w:history="1">
+      <w:hyperlink w:anchor="_Toc242726630" w:history="1">
         <w:r>
           <w:rPr>
             <w:rStyle w:val="Hyperlink"/>
@@ -6437,7 +6446,7 @@
             <w:noProof/>
             <w:webHidden/>
           </w:rPr>
-          <w:instrText xml:space="preserve"> PAGEREF _Toc242714341 \h </w:instrText>
+          <w:instrText xml:space="preserve"> PAGEREF _Toc242726630 \h </w:instrText>
         </w:r>
         <w:r>
           <w:rPr>
@@ -6485,7 +6494,7 @@
           <w14:ligatures w14:val="standardContextual"/>
         </w:rPr>
       </w:pPr>
-      <w:hyperlink w:anchor="_Toc242714342" w:history="1">
+      <w:hyperlink w:anchor="_Toc242726631" w:history="1">
         <w:r>
           <w:rPr>
             <w:rStyle w:val="Hyperlink"/>
@@ -6520,7 +6529,7 @@
             <w:noProof/>
             <w:webHidden/>
           </w:rPr>
-          <w:instrText xml:space="preserve"> PAGEREF _Toc242714342 \h </w:instrText>
+          <w:instrText xml:space="preserve"> PAGEREF _Toc242726631 \h </w:instrText>
         </w:r>
         <w:r>
           <w:rPr>
@@ -6568,7 +6577,7 @@
           <w14:ligatures w14:val="standardContextual"/>
         </w:rPr>
       </w:pPr>
-      <w:hyperlink w:anchor="_Toc242714343" w:history="1">
+      <w:hyperlink w:anchor="_Toc242726632" w:history="1">
         <w:r>
           <w:rPr>
             <w:rStyle w:val="Hyperlink"/>
@@ -6603,7 +6612,7 @@
             <w:noProof/>
             <w:webHidden/>
           </w:rPr>
-          <w:instrText xml:space="preserve"> PAGEREF _Toc242714343 \h </w:instrText>
+          <w:instrText xml:space="preserve"> PAGEREF _Toc242726632 \h </w:instrText>
         </w:r>
         <w:r>
           <w:rPr>
@@ -6651,7 +6660,7 @@
           <w14:ligatures w14:val="standardContextual"/>
         </w:rPr>
       </w:pPr>
-      <w:hyperlink w:anchor="_Toc242714344" w:history="1">
+      <w:hyperlink w:anchor="_Toc242726633" w:history="1">
         <w:r>
           <w:rPr>
             <w:rStyle w:val="Hyperlink"/>
@@ -6686,7 +6695,7 @@
             <w:noProof/>
             <w:webHidden/>
           </w:rPr>
-          <w:instrText xml:space="preserve"> PAGEREF _Toc242714344 \h </w:instrText>
+          <w:instrText xml:space="preserve"> PAGEREF _Toc242726633 \h </w:instrText>
         </w:r>
         <w:r>
           <w:rPr>
@@ -6761,7 +6770,7 @@
       <w:r>
         <w:fldChar w:fldCharType="separate"/>
       </w:r>
-      <w:hyperlink w:anchor="_Toc242714345" w:history="1">
+      <w:hyperlink w:anchor="_Toc242726634" w:history="1">
         <w:r>
           <w:rPr>
             <w:rStyle w:val="Hyperlink"/>
@@ -6796,7 +6805,7 @@
             <w:noProof/>
             <w:webHidden/>
           </w:rPr>
-          <w:instrText xml:space="preserve"> PAGEREF _Toc242714345 \h </w:instrText>
+          <w:instrText xml:space="preserve"> PAGEREF _Toc242726634 \h </w:instrText>
         </w:r>
         <w:r>
           <w:rPr>
@@ -6844,7 +6853,7 @@
           <w14:ligatures w14:val="standardContextual"/>
         </w:rPr>
       </w:pPr>
-      <w:hyperlink w:anchor="_Toc242714346" w:history="1">
+      <w:hyperlink w:anchor="_Toc242726635" w:history="1">
         <w:r>
           <w:rPr>
             <w:rStyle w:val="Hyperlink"/>
@@ -6879,7 +6888,7 @@
             <w:noProof/>
             <w:webHidden/>
           </w:rPr>
-          <w:instrText xml:space="preserve"> PAGEREF _Toc242714346 \h </w:instrText>
+          <w:instrText xml:space="preserve"> PAGEREF _Toc242726635 \h </w:instrText>
         </w:r>
         <w:r>
           <w:rPr>
@@ -6927,7 +6936,7 @@
           <w14:ligatures w14:val="standardContextual"/>
         </w:rPr>
       </w:pPr>
-      <w:hyperlink w:anchor="_Toc242714347" w:history="1">
+      <w:hyperlink w:anchor="_Toc242726636" w:history="1">
         <w:r>
           <w:rPr>
             <w:rStyle w:val="Hyperlink"/>
@@ -6962,7 +6971,7 @@
             <w:noProof/>
             <w:webHidden/>
           </w:rPr>
-          <w:instrText xml:space="preserve"> PAGEREF _Toc242714347 \h </w:instrText>
+          <w:instrText xml:space="preserve"> PAGEREF _Toc242726636 \h </w:instrText>
         </w:r>
         <w:r>
           <w:rPr>
@@ -7010,7 +7019,7 @@
           <w14:ligatures w14:val="standardContextual"/>
         </w:rPr>
       </w:pPr>
-      <w:hyperlink w:anchor="_Toc242714348" w:history="1">
+      <w:hyperlink w:anchor="_Toc242726637" w:history="1">
         <w:r>
           <w:rPr>
             <w:rStyle w:val="Hyperlink"/>
@@ -7045,7 +7054,7 @@
             <w:noProof/>
             <w:webHidden/>
           </w:rPr>
-          <w:instrText xml:space="preserve"> PAGEREF _Toc242714348 \h </w:instrText>
+          <w:instrText xml:space="preserve"> PAGEREF _Toc242726637 \h </w:instrText>
         </w:r>
         <w:r>
           <w:rPr>
@@ -7093,7 +7102,7 @@
           <w14:ligatures w14:val="standardContextual"/>
         </w:rPr>
       </w:pPr>
-      <w:hyperlink w:anchor="_Toc242714349" w:history="1">
+      <w:hyperlink w:anchor="_Toc242726638" w:history="1">
         <w:r>
           <w:rPr>
             <w:rStyle w:val="Hyperlink"/>
@@ -7128,7 +7137,7 @@
             <w:noProof/>
             <w:webHidden/>
           </w:rPr>
-          <w:instrText xml:space="preserve"> PAGEREF _Toc242714349 \h </w:instrText>
+          <w:instrText xml:space="preserve"> PAGEREF _Toc242726638 \h </w:instrText>
         </w:r>
         <w:r>
           <w:rPr>
@@ -7176,7 +7185,7 @@
           <w14:ligatures w14:val="standardContextual"/>
         </w:rPr>
       </w:pPr>
-      <w:hyperlink w:anchor="_Toc242714350" w:history="1">
+      <w:hyperlink w:anchor="_Toc242726639" w:history="1">
         <w:r>
           <w:rPr>
             <w:rStyle w:val="Hyperlink"/>
@@ -7211,7 +7220,7 @@
             <w:noProof/>
             <w:webHidden/>
           </w:rPr>
-          <w:instrText xml:space="preserve"> PAGEREF _Toc242714350 \h </w:instrText>
+          <w:instrText xml:space="preserve"> PAGEREF _Toc242726639 \h </w:instrText>
         </w:r>
         <w:r>
           <w:rPr>
@@ -7259,7 +7268,7 @@
           <w14:ligatures w14:val="standardContextual"/>
         </w:rPr>
       </w:pPr>
-      <w:hyperlink w:anchor="_Toc242714351" w:history="1">
+      <w:hyperlink w:anchor="_Toc242726640" w:history="1">
         <w:r>
           <w:rPr>
             <w:rStyle w:val="Hyperlink"/>
@@ -7294,7 +7303,7 @@
             <w:noProof/>
             <w:webHidden/>
           </w:rPr>
-          <w:instrText xml:space="preserve"> PAGEREF _Toc242714351 \h </w:instrText>
+          <w:instrText xml:space="preserve"> PAGEREF _Toc242726640 \h </w:instrText>
         </w:r>
         <w:r>
           <w:rPr>
@@ -7342,7 +7351,7 @@
           <w14:ligatures w14:val="standardContextual"/>
         </w:rPr>
       </w:pPr>
-      <w:hyperlink w:anchor="_Toc242714352" w:history="1">
+      <w:hyperlink w:anchor="_Toc242726641" w:history="1">
         <w:r>
           <w:rPr>
             <w:rStyle w:val="Hyperlink"/>
@@ -7377,7 +7386,7 @@
             <w:noProof/>
             <w:webHidden/>
           </w:rPr>
-          <w:instrText xml:space="preserve"> PAGEREF _Toc242714352 \h </w:instrText>
+          <w:instrText xml:space="preserve"> PAGEREF _Toc242726641 \h </w:instrText>
         </w:r>
         <w:r>
           <w:rPr>
@@ -7425,7 +7434,7 @@
           <w14:ligatures w14:val="standardContextual"/>
         </w:rPr>
       </w:pPr>
-      <w:hyperlink w:anchor="_Toc242714353" w:history="1">
+      <w:hyperlink w:anchor="_Toc242726642" w:history="1">
         <w:r>
           <w:rPr>
             <w:rStyle w:val="Hyperlink"/>
@@ -7460,7 +7469,7 @@
             <w:noProof/>
             <w:webHidden/>
           </w:rPr>
-          <w:instrText xml:space="preserve"> PAGEREF _Toc242714353 \h </w:instrText>
+          <w:instrText xml:space="preserve"> PAGEREF _Toc242726642 \h </w:instrText>
         </w:r>
         <w:r>
           <w:rPr>
@@ -7508,7 +7517,7 @@
           <w14:ligatures w14:val="standardContextual"/>
         </w:rPr>
       </w:pPr>
-      <w:hyperlink w:anchor="_Toc242714354" w:history="1">
+      <w:hyperlink w:anchor="_Toc242726643" w:history="1">
         <w:r>
           <w:rPr>
             <w:rStyle w:val="Hyperlink"/>
@@ -7558,7 +7567,7 @@
             <w:noProof/>
             <w:webHidden/>
           </w:rPr>
-          <w:instrText xml:space="preserve"> PAGEREF _Toc242714354 \h </w:instrText>
+          <w:instrText xml:space="preserve"> PAGEREF _Toc242726643 \h </w:instrText>
         </w:r>
         <w:r>
           <w:rPr>
@@ -7606,7 +7615,7 @@
           <w14:ligatures w14:val="standardContextual"/>
         </w:rPr>
       </w:pPr>
-      <w:hyperlink w:anchor="_Toc242714355" w:history="1">
+      <w:hyperlink w:anchor="_Toc242726644" w:history="1">
         <w:r>
           <w:rPr>
             <w:rStyle w:val="Hyperlink"/>
@@ -7641,7 +7650,7 @@
             <w:noProof/>
             <w:webHidden/>
           </w:rPr>
-          <w:instrText xml:space="preserve"> PAGEREF _Toc242714355 \h </w:instrText>
+          <w:instrText xml:space="preserve"> PAGEREF _Toc242726644 \h </w:instrText>
         </w:r>
         <w:r>
           <w:rPr>
@@ -7689,7 +7698,7 @@
           <w14:ligatures w14:val="standardContextual"/>
         </w:rPr>
       </w:pPr>
-      <w:hyperlink w:anchor="_Toc242714356" w:history="1">
+      <w:hyperlink w:anchor="_Toc242726645" w:history="1">
         <w:r>
           <w:rPr>
             <w:rStyle w:val="Hyperlink"/>
@@ -7724,7 +7733,7 @@
             <w:noProof/>
             <w:webHidden/>
           </w:rPr>
-          <w:instrText xml:space="preserve"> PAGEREF _Toc242714356 \h </w:instrText>
+          <w:instrText xml:space="preserve"> PAGEREF _Toc242726645 \h </w:instrText>
         </w:r>
         <w:r>
           <w:rPr>
@@ -7772,7 +7781,7 @@
           <w14:ligatures w14:val="standardContextual"/>
         </w:rPr>
       </w:pPr>
-      <w:hyperlink w:anchor="_Toc242714357" w:history="1">
+      <w:hyperlink w:anchor="_Toc242726646" w:history="1">
         <w:r>
           <w:rPr>
             <w:rStyle w:val="Hyperlink"/>
@@ -7807,7 +7816,7 @@
             <w:noProof/>
             <w:webHidden/>
           </w:rPr>
-          <w:instrText xml:space="preserve"> PAGEREF _Toc242714357 \h </w:instrText>
+          <w:instrText xml:space="preserve"> PAGEREF _Toc242726646 \h </w:instrText>
         </w:r>
         <w:r>
           <w:rPr>
@@ -7855,7 +7864,7 @@
           <w14:ligatures w14:val="standardContextual"/>
         </w:rPr>
       </w:pPr>
-      <w:hyperlink w:anchor="_Toc242714358" w:history="1">
+      <w:hyperlink w:anchor="_Toc242726647" w:history="1">
         <w:r>
           <w:rPr>
             <w:rStyle w:val="Hyperlink"/>
@@ -7890,7 +7899,7 @@
             <w:noProof/>
             <w:webHidden/>
           </w:rPr>
-          <w:instrText xml:space="preserve"> PAGEREF _Toc242714358 \h </w:instrText>
+          <w:instrText xml:space="preserve"> PAGEREF _Toc242726647 \h </w:instrText>
         </w:r>
         <w:r>
           <w:rPr>
@@ -7938,7 +7947,7 @@
           <w14:ligatures w14:val="standardContextual"/>
         </w:rPr>
       </w:pPr>
-      <w:hyperlink w:anchor="_Toc242714359" w:history="1">
+      <w:hyperlink w:anchor="_Toc242726648" w:history="1">
         <w:r>
           <w:rPr>
             <w:rStyle w:val="Hyperlink"/>
@@ -7973,7 +7982,7 @@
             <w:noProof/>
             <w:webHidden/>
           </w:rPr>
-          <w:instrText xml:space="preserve"> PAGEREF _Toc242714359 \h </w:instrText>
+          <w:instrText xml:space="preserve"> PAGEREF _Toc242726648 \h </w:instrText>
         </w:r>
         <w:r>
           <w:rPr>
@@ -8021,7 +8030,7 @@
           <w14:ligatures w14:val="standardContextual"/>
         </w:rPr>
       </w:pPr>
-      <w:hyperlink w:anchor="_Toc242714360" w:history="1">
+      <w:hyperlink w:anchor="_Toc242726649" w:history="1">
         <w:r>
           <w:rPr>
             <w:rStyle w:val="Hyperlink"/>
@@ -8056,7 +8065,7 @@
             <w:noProof/>
             <w:webHidden/>
           </w:rPr>
-          <w:instrText xml:space="preserve"> PAGEREF _Toc242714360 \h </w:instrText>
+          <w:instrText xml:space="preserve"> PAGEREF _Toc242726649 \h </w:instrText>
         </w:r>
         <w:r>
           <w:rPr>
@@ -8118,7 +8127,7 @@
       <w:pPr>
         <w:pStyle w:val="Heading1"/>
       </w:pPr>
-      <w:bookmarkStart w:id="0" w:name="_Toc242714261"/>
+      <w:bookmarkStart w:id="0" w:name="_Toc242726550"/>
       <w:r>
         <w:lastRenderedPageBreak/>
         <w:t>1. INTRODUCTION AND OBJECTIVE</w:t>
@@ -8129,7 +8138,7 @@
       <w:pPr>
         <w:pStyle w:val="Heading2"/>
       </w:pPr>
-      <w:bookmarkStart w:id="1" w:name="_Toc242714262"/>
+      <w:bookmarkStart w:id="1" w:name="_Toc242726551"/>
       <w:r>
         <w:t>1.1 Background</w:t>
       </w:r>
@@ -8161,7 +8170,7 @@
       <w:pPr>
         <w:pStyle w:val="Heading2"/>
       </w:pPr>
-      <w:bookmarkStart w:id="2" w:name="_Toc242714263"/>
+      <w:bookmarkStart w:id="2" w:name="_Toc242726552"/>
       <w:r>
         <w:t>1.2 Problem Statement</w:t>
       </w:r>
@@ -8182,7 +8191,7 @@
       <w:pPr>
         <w:pStyle w:val="Heading2"/>
       </w:pPr>
-      <w:bookmarkStart w:id="3" w:name="_Toc242714264"/>
+      <w:bookmarkStart w:id="3" w:name="_Toc242726553"/>
       <w:r>
         <w:t>1.3 Objectives</w:t>
       </w:r>
@@ -8256,7 +8265,7 @@
       <w:pPr>
         <w:pStyle w:val="Heading2"/>
       </w:pPr>
-      <w:bookmarkStart w:id="4" w:name="_Toc242714265"/>
+      <w:bookmarkStart w:id="4" w:name="_Toc242726554"/>
       <w:r>
         <w:t>1.4 Review of Related Literature</w:t>
       </w:r>
@@ -8307,7 +8316,7 @@
       <w:pPr>
         <w:pStyle w:val="Heading2"/>
       </w:pPr>
-      <w:bookmarkStart w:id="5" w:name="_Toc242714266"/>
+      <w:bookmarkStart w:id="5" w:name="_Toc242726555"/>
       <w:r>
         <w:lastRenderedPageBreak/>
         <w:t>1.5 Organisation of the Report</w:t>
@@ -8327,7 +8336,7 @@
         <w:pStyle w:val="Heading1"/>
         <w:pageBreakBefore/>
       </w:pPr>
-      <w:bookmarkStart w:id="6" w:name="_Toc242714267"/>
+      <w:bookmarkStart w:id="6" w:name="_Toc242726556"/>
       <w:r>
         <w:lastRenderedPageBreak/>
         <w:t>2. DATASET DESCRIPTION</w:t>
@@ -8338,7 +8347,7 @@
       <w:pPr>
         <w:pStyle w:val="Heading2"/>
       </w:pPr>
-      <w:bookmarkStart w:id="7" w:name="_Toc242714268"/>
+      <w:bookmarkStart w:id="7" w:name="_Toc242726557"/>
       <w:r>
         <w:t>2.1 Source and Licence</w:t>
       </w:r>
@@ -8356,7 +8365,7 @@
       <w:pPr>
         <w:pStyle w:val="Heading2"/>
       </w:pPr>
-      <w:bookmarkStart w:id="8" w:name="_Toc242714269"/>
+      <w:bookmarkStart w:id="8" w:name="_Toc242726558"/>
       <w:r>
         <w:t>2.2 Size and Structure</w:t>
       </w:r>
@@ -8423,7 +8432,7 @@
       <w:pPr>
         <w:pStyle w:val="TabCaption"/>
       </w:pPr>
-      <w:bookmarkStart w:id="9" w:name="_Toc242714345"/>
+      <w:bookmarkStart w:id="9" w:name="_Toc242726634"/>
       <w:r>
         <w:rPr>
           <w:b/>
@@ -10063,7 +10072,7 @@
       <w:pPr>
         <w:pStyle w:val="Heading2"/>
       </w:pPr>
-      <w:bookmarkStart w:id="10" w:name="_Toc242714270"/>
+      <w:bookmarkStart w:id="10" w:name="_Toc242726559"/>
       <w:r>
         <w:lastRenderedPageBreak/>
         <w:t>2.3 Basic Statistics</w:t>
@@ -10082,7 +10091,7 @@
       <w:pPr>
         <w:pStyle w:val="TabCaption"/>
       </w:pPr>
-      <w:bookmarkStart w:id="11" w:name="_Toc242714346"/>
+      <w:bookmarkStart w:id="11" w:name="_Toc242726635"/>
       <w:r>
         <w:rPr>
           <w:b/>
@@ -13496,7 +13505,7 @@
           <w:noProof/>
         </w:rPr>
         <w:drawing>
-          <wp:inline distT="0" distB="0" distL="0" distR="0" wp14:anchorId="4ADAAC67" wp14:editId="4214D13F">
+          <wp:inline distT="0" distB="0" distL="0" distR="0" wp14:anchorId="4A28807B" wp14:editId="0ED5CBF9">
             <wp:extent cx="5486400" cy="1665289"/>
             <wp:effectExtent l="0" t="0" r="0" b="0"/>
             <wp:docPr id="2" name="Picture 2"/>
@@ -13536,7 +13545,7 @@
       <w:pPr>
         <w:pStyle w:val="FigCaption"/>
       </w:pPr>
-      <w:bookmarkStart w:id="12" w:name="_Toc242714320"/>
+      <w:bookmarkStart w:id="12" w:name="_Toc242726609"/>
       <w:r>
         <w:rPr>
           <w:b/>
@@ -13561,7 +13570,7 @@
         <w:pStyle w:val="Heading1"/>
         <w:pageBreakBefore/>
       </w:pPr>
-      <w:bookmarkStart w:id="13" w:name="_Toc242714271"/>
+      <w:bookmarkStart w:id="13" w:name="_Toc242726560"/>
       <w:r>
         <w:lastRenderedPageBreak/>
         <w:t>3. EXPLORATORY DATA ANALYSIS AND PREPROCESSING</w:t>
@@ -13580,7 +13589,7 @@
       <w:pPr>
         <w:pStyle w:val="Heading2"/>
       </w:pPr>
-      <w:bookmarkStart w:id="14" w:name="_Toc242714272"/>
+      <w:bookmarkStart w:id="14" w:name="_Toc242726561"/>
       <w:r>
         <w:t>3.1 Missing Values and Logical Consistency</w:t>
       </w:r>
@@ -13607,7 +13616,7 @@
       <w:pPr>
         <w:pStyle w:val="TabCaption"/>
       </w:pPr>
-      <w:bookmarkStart w:id="15" w:name="_Toc242714347"/>
+      <w:bookmarkStart w:id="15" w:name="_Toc242726636"/>
       <w:r>
         <w:rPr>
           <w:b/>
@@ -14003,7 +14012,7 @@
       <w:pPr>
         <w:pStyle w:val="Heading2"/>
       </w:pPr>
-      <w:bookmarkStart w:id="16" w:name="_Toc242714273"/>
+      <w:bookmarkStart w:id="16" w:name="_Toc242726562"/>
       <w:r>
         <w:t>3.2 Duplicate Sessions</w:t>
       </w:r>
@@ -14036,7 +14045,7 @@
       <w:pPr>
         <w:pStyle w:val="Heading2"/>
       </w:pPr>
-      <w:bookmarkStart w:id="17" w:name="_Toc242714274"/>
+      <w:bookmarkStart w:id="17" w:name="_Toc242726563"/>
       <w:r>
         <w:t>3.3 Outlier Analysis</w:t>
       </w:r>
@@ -14054,7 +14063,7 @@
       <w:pPr>
         <w:pStyle w:val="TabCaption"/>
       </w:pPr>
-      <w:bookmarkStart w:id="18" w:name="_Toc242714348"/>
+      <w:bookmarkStart w:id="18" w:name="_Toc242726637"/>
       <w:r>
         <w:rPr>
           <w:b/>
@@ -16853,7 +16862,7 @@
           <w:noProof/>
         </w:rPr>
         <w:drawing>
-          <wp:inline distT="0" distB="0" distL="0" distR="0" wp14:anchorId="33AC31F5" wp14:editId="70055633">
+          <wp:inline distT="0" distB="0" distL="0" distR="0" wp14:anchorId="3AFEC867" wp14:editId="5B5AF30E">
             <wp:extent cx="5486400" cy="1946300"/>
             <wp:effectExtent l="0" t="0" r="0" b="0"/>
             <wp:docPr id="3" name="Picture 3"/>
@@ -16893,7 +16902,7 @@
       <w:pPr>
         <w:pStyle w:val="FigCaption"/>
       </w:pPr>
-      <w:bookmarkStart w:id="19" w:name="_Toc242714321"/>
+      <w:bookmarkStart w:id="19" w:name="_Toc242726610"/>
       <w:r>
         <w:rPr>
           <w:b/>
@@ -16920,7 +16929,7 @@
       <w:pPr>
         <w:pStyle w:val="Heading2"/>
       </w:pPr>
-      <w:bookmarkStart w:id="20" w:name="_Toc242714275"/>
+      <w:bookmarkStart w:id="20" w:name="_Toc242726564"/>
       <w:r>
         <w:t>3.4 Transformation: Tukey's Ladder of Powers</w:t>
       </w:r>
@@ -16955,7 +16964,7 @@
         </w:rPr>
         <w:lastRenderedPageBreak/>
         <w:drawing>
-          <wp:inline distT="0" distB="0" distL="0" distR="0" wp14:anchorId="17C8C656" wp14:editId="0C6D82A0">
+          <wp:inline distT="0" distB="0" distL="0" distR="0" wp14:anchorId="4B2B3F8B" wp14:editId="5531A112">
             <wp:extent cx="5486400" cy="1416729"/>
             <wp:effectExtent l="0" t="0" r="0" b="0"/>
             <wp:docPr id="4" name="Picture 4"/>
@@ -16995,7 +17004,7 @@
       <w:pPr>
         <w:pStyle w:val="FigCaption"/>
       </w:pPr>
-      <w:bookmarkStart w:id="21" w:name="_Toc242714322"/>
+      <w:bookmarkStart w:id="21" w:name="_Toc242726611"/>
       <w:r>
         <w:rPr>
           <w:b/>
@@ -17019,7 +17028,7 @@
       <w:pPr>
         <w:pStyle w:val="Heading2"/>
       </w:pPr>
-      <w:bookmarkStart w:id="22" w:name="_Toc242714276"/>
+      <w:bookmarkStart w:id="22" w:name="_Toc242726565"/>
       <w:r>
         <w:t>3.5 Scaling and Standardisation</w:t>
       </w:r>
@@ -17088,7 +17097,7 @@
       <w:pPr>
         <w:pStyle w:val="Heading2"/>
       </w:pPr>
-      <w:bookmarkStart w:id="23" w:name="_Toc242714277"/>
+      <w:bookmarkStart w:id="23" w:name="_Toc242726566"/>
       <w:r>
         <w:t>3.6 Feature Engineering and Encoding</w:t>
       </w:r>
@@ -17098,7 +17107,7 @@
       <w:pPr>
         <w:pStyle w:val="TabCaption"/>
       </w:pPr>
-      <w:bookmarkStart w:id="24" w:name="_Toc242714349"/>
+      <w:bookmarkStart w:id="24" w:name="_Toc242726638"/>
       <w:r>
         <w:rPr>
           <w:b/>
@@ -17544,7 +17553,7 @@
       <w:pPr>
         <w:pStyle w:val="Heading2"/>
       </w:pPr>
-      <w:bookmarkStart w:id="25" w:name="_Toc242714278"/>
+      <w:bookmarkStart w:id="25" w:name="_Toc242726567"/>
       <w:r>
         <w:t>3.7 Train, Validation and Test Split</w:t>
       </w:r>
@@ -17562,7 +17571,7 @@
       <w:pPr>
         <w:pStyle w:val="TabCaption"/>
       </w:pPr>
-      <w:bookmarkStart w:id="26" w:name="_Toc242714350"/>
+      <w:bookmarkStart w:id="26" w:name="_Toc242726639"/>
       <w:r>
         <w:rPr>
           <w:b/>
@@ -18080,7 +18089,7 @@
       <w:pPr>
         <w:pStyle w:val="Heading2"/>
       </w:pPr>
-      <w:bookmarkStart w:id="27" w:name="_Toc242714279"/>
+      <w:bookmarkStart w:id="27" w:name="_Toc242726568"/>
       <w:r>
         <w:t>3.8 Key Insights from EDA and Preprocessing</w:t>
       </w:r>
@@ -18127,7 +18136,7 @@
         <w:pStyle w:val="Heading1"/>
         <w:pageBreakBefore/>
       </w:pPr>
-      <w:bookmarkStart w:id="28" w:name="_Toc242714280"/>
+      <w:bookmarkStart w:id="28" w:name="_Toc242726569"/>
       <w:r>
         <w:lastRenderedPageBreak/>
         <w:t>4. DATA VISUALIZATION</w:t>
@@ -18146,7 +18155,7 @@
       <w:pPr>
         <w:pStyle w:val="Heading2"/>
       </w:pPr>
-      <w:bookmarkStart w:id="29" w:name="_Toc242714281"/>
+      <w:bookmarkStart w:id="29" w:name="_Toc242726570"/>
       <w:r>
         <w:t>4.1 The Seven Stages of Visualization Applied</w:t>
       </w:r>
@@ -18156,7 +18165,7 @@
       <w:pPr>
         <w:pStyle w:val="TabCaption"/>
       </w:pPr>
-      <w:bookmarkStart w:id="30" w:name="_Toc242714351"/>
+      <w:bookmarkStart w:id="30" w:name="_Toc242726640"/>
       <w:r>
         <w:rPr>
           <w:b/>
@@ -18660,7 +18669,7 @@
       <w:pPr>
         <w:pStyle w:val="Heading2"/>
       </w:pPr>
-      <w:bookmarkStart w:id="31" w:name="_Toc242714282"/>
+      <w:bookmarkStart w:id="31" w:name="_Toc242726571"/>
       <w:r>
         <w:t>4.2 Univariate Distributions of All Numerical Features</w:t>
       </w:r>
@@ -18677,7 +18686,7 @@
           <w:noProof/>
         </w:rPr>
         <w:drawing>
-          <wp:inline distT="0" distB="0" distL="0" distR="0" wp14:anchorId="6038DC23" wp14:editId="00620469">
+          <wp:inline distT="0" distB="0" distL="0" distR="0" wp14:anchorId="6BFD06C1" wp14:editId="64F9046F">
             <wp:extent cx="5486400" cy="2267560"/>
             <wp:effectExtent l="0" t="0" r="0" b="0"/>
             <wp:docPr id="5" name="Picture 5"/>
@@ -18717,7 +18726,7 @@
       <w:pPr>
         <w:pStyle w:val="FigCaption"/>
       </w:pPr>
-      <w:bookmarkStart w:id="32" w:name="_Toc242714323"/>
+      <w:bookmarkStart w:id="32" w:name="_Toc242726612"/>
       <w:r>
         <w:rPr>
           <w:b/>
@@ -18776,7 +18785,7 @@
       <w:pPr>
         <w:pStyle w:val="Heading2"/>
       </w:pPr>
-      <w:bookmarkStart w:id="33" w:name="_Toc242714283"/>
+      <w:bookmarkStart w:id="33" w:name="_Toc242726572"/>
       <w:r>
         <w:t>4.3 Inequality of Engagement: Lorenz Curves and the Gini Coefficient</w:t>
       </w:r>
@@ -18793,7 +18802,7 @@
           <w:noProof/>
         </w:rPr>
         <w:drawing>
-          <wp:inline distT="0" distB="0" distL="0" distR="0" wp14:anchorId="4B4FCD84" wp14:editId="4F8C2296">
+          <wp:inline distT="0" distB="0" distL="0" distR="0" wp14:anchorId="402C0CF0" wp14:editId="74F91B44">
             <wp:extent cx="3931920" cy="3413943"/>
             <wp:effectExtent l="0" t="0" r="0" b="0"/>
             <wp:docPr id="6" name="Picture 6"/>
@@ -18833,7 +18842,7 @@
       <w:pPr>
         <w:pStyle w:val="FigCaption"/>
       </w:pPr>
-      <w:bookmarkStart w:id="34" w:name="_Toc242714324"/>
+      <w:bookmarkStart w:id="34" w:name="_Toc242726613"/>
       <w:r>
         <w:rPr>
           <w:b/>
@@ -18891,7 +18900,7 @@
       <w:pPr>
         <w:pStyle w:val="Heading2"/>
       </w:pPr>
-      <w:bookmarkStart w:id="35" w:name="_Toc242714284"/>
+      <w:bookmarkStart w:id="35" w:name="_Toc242726573"/>
       <w:r>
         <w:lastRenderedPageBreak/>
         <w:t>4.4 Discrete Distribution of Product Page Counts</w:t>
@@ -18909,7 +18918,7 @@
           <w:noProof/>
         </w:rPr>
         <w:drawing>
-          <wp:inline distT="0" distB="0" distL="0" distR="0" wp14:anchorId="4E17B05B" wp14:editId="7DD5610E">
+          <wp:inline distT="0" distB="0" distL="0" distR="0" wp14:anchorId="1397F5DE" wp14:editId="47C00A5C">
             <wp:extent cx="5486400" cy="1866884"/>
             <wp:effectExtent l="0" t="0" r="0" b="0"/>
             <wp:docPr id="7" name="Picture 7"/>
@@ -18949,7 +18958,7 @@
       <w:pPr>
         <w:pStyle w:val="FigCaption"/>
       </w:pPr>
-      <w:bookmarkStart w:id="36" w:name="_Toc242714325"/>
+      <w:bookmarkStart w:id="36" w:name="_Toc242726614"/>
       <w:r>
         <w:rPr>
           <w:b/>
@@ -18965,7 +18974,7 @@
       <w:pPr>
         <w:pStyle w:val="TabCaption"/>
       </w:pPr>
-      <w:bookmarkStart w:id="37" w:name="_Toc242714352"/>
+      <w:bookmarkStart w:id="37" w:name="_Toc242726641"/>
       <w:r>
         <w:rPr>
           <w:b/>
@@ -19488,7 +19497,7 @@
       <w:pPr>
         <w:pStyle w:val="Heading2"/>
       </w:pPr>
-      <w:bookmarkStart w:id="38" w:name="_Toc242714285"/>
+      <w:bookmarkStart w:id="38" w:name="_Toc242726574"/>
       <w:r>
         <w:lastRenderedPageBreak/>
         <w:t>4.5 Continuous Distribution of Browsing Time</w:t>
@@ -19506,7 +19515,7 @@
           <w:noProof/>
         </w:rPr>
         <w:drawing>
-          <wp:inline distT="0" distB="0" distL="0" distR="0" wp14:anchorId="7DF959A8" wp14:editId="61F180BC">
+          <wp:inline distT="0" distB="0" distL="0" distR="0" wp14:anchorId="2D5A348E" wp14:editId="789EE9D9">
             <wp:extent cx="5486400" cy="1918641"/>
             <wp:effectExtent l="0" t="0" r="0" b="0"/>
             <wp:docPr id="8" name="Picture 8"/>
@@ -19546,7 +19555,7 @@
       <w:pPr>
         <w:pStyle w:val="FigCaption"/>
       </w:pPr>
-      <w:bookmarkStart w:id="39" w:name="_Toc242714326"/>
+      <w:bookmarkStart w:id="39" w:name="_Toc242726615"/>
       <w:r>
         <w:rPr>
           <w:b/>
@@ -19562,7 +19571,7 @@
       <w:pPr>
         <w:pStyle w:val="TabCaption"/>
       </w:pPr>
-      <w:bookmarkStart w:id="40" w:name="_Toc242714353"/>
+      <w:bookmarkStart w:id="40" w:name="_Toc242726642"/>
       <w:r>
         <w:rPr>
           <w:b/>
@@ -20359,7 +20368,7 @@
       <w:pPr>
         <w:pStyle w:val="Heading2"/>
       </w:pPr>
-      <w:bookmarkStart w:id="41" w:name="_Toc242714286"/>
+      <w:bookmarkStart w:id="41" w:name="_Toc242726575"/>
       <w:r>
         <w:lastRenderedPageBreak/>
         <w:t>4.6 Conversion as a Binomial Process across Months</w:t>
@@ -20377,7 +20386,7 @@
           <w:noProof/>
         </w:rPr>
         <w:drawing>
-          <wp:inline distT="0" distB="0" distL="0" distR="0" wp14:anchorId="08E48C22" wp14:editId="42E0B40A">
+          <wp:inline distT="0" distB="0" distL="0" distR="0" wp14:anchorId="037E27DE" wp14:editId="19CC10D8">
             <wp:extent cx="5486400" cy="3144678"/>
             <wp:effectExtent l="0" t="0" r="0" b="0"/>
             <wp:docPr id="9" name="Picture 9"/>
@@ -20417,7 +20426,7 @@
       <w:pPr>
         <w:pStyle w:val="FigCaption"/>
       </w:pPr>
-      <w:bookmarkStart w:id="42" w:name="_Toc242714327"/>
+      <w:bookmarkStart w:id="42" w:name="_Toc242726616"/>
       <w:r>
         <w:rPr>
           <w:b/>
@@ -20484,7 +20493,7 @@
       <w:pPr>
         <w:pStyle w:val="Heading2"/>
       </w:pPr>
-      <w:bookmarkStart w:id="43" w:name="_Toc242714287"/>
+      <w:bookmarkStart w:id="43" w:name="_Toc242726576"/>
       <w:r>
         <w:lastRenderedPageBreak/>
         <w:t>4.7 Buyers versus Non-Buyers</w:t>
@@ -20502,7 +20511,7 @@
           <w:noProof/>
         </w:rPr>
         <w:drawing>
-          <wp:inline distT="0" distB="0" distL="0" distR="0" wp14:anchorId="4167CC9C" wp14:editId="46214281">
+          <wp:inline distT="0" distB="0" distL="0" distR="0" wp14:anchorId="44AEF3DA" wp14:editId="06CDD3AE">
             <wp:extent cx="5486400" cy="1666494"/>
             <wp:effectExtent l="0" t="0" r="0" b="0"/>
             <wp:docPr id="10" name="Picture 10"/>
@@ -20542,7 +20551,7 @@
       <w:pPr>
         <w:pStyle w:val="FigCaption"/>
       </w:pPr>
-      <w:bookmarkStart w:id="44" w:name="_Toc242714328"/>
+      <w:bookmarkStart w:id="44" w:name="_Toc242726617"/>
       <w:r>
         <w:rPr>
           <w:b/>
@@ -20558,7 +20567,7 @@
       <w:pPr>
         <w:pStyle w:val="TabCaption"/>
       </w:pPr>
-      <w:bookmarkStart w:id="45" w:name="_Toc242714354"/>
+      <w:bookmarkStart w:id="45" w:name="_Toc242726643"/>
       <w:r>
         <w:rPr>
           <w:b/>
@@ -22356,7 +22365,7 @@
       <w:pPr>
         <w:pStyle w:val="Heading2"/>
       </w:pPr>
-      <w:bookmarkStart w:id="46" w:name="_Toc242714288"/>
+      <w:bookmarkStart w:id="46" w:name="_Toc242726577"/>
       <w:r>
         <w:lastRenderedPageBreak/>
         <w:t>4.8 Conversion Lift by Page Value and Exit Rate</w:t>
@@ -22374,7 +22383,7 @@
           <w:noProof/>
         </w:rPr>
         <w:drawing>
-          <wp:inline distT="0" distB="0" distL="0" distR="0" wp14:anchorId="050133CC" wp14:editId="1A2CBFED">
+          <wp:inline distT="0" distB="0" distL="0" distR="0" wp14:anchorId="213E79C1" wp14:editId="74D195C9">
             <wp:extent cx="5486400" cy="1716071"/>
             <wp:effectExtent l="0" t="0" r="0" b="0"/>
             <wp:docPr id="11" name="Picture 11"/>
@@ -22414,7 +22423,7 @@
       <w:pPr>
         <w:pStyle w:val="FigCaption"/>
       </w:pPr>
-      <w:bookmarkStart w:id="47" w:name="_Toc242714329"/>
+      <w:bookmarkStart w:id="47" w:name="_Toc242726618"/>
       <w:r>
         <w:rPr>
           <w:b/>
@@ -22472,7 +22481,7 @@
       <w:pPr>
         <w:pStyle w:val="Heading2"/>
       </w:pPr>
-      <w:bookmarkStart w:id="48" w:name="_Toc242714289"/>
+      <w:bookmarkStart w:id="48" w:name="_Toc242726578"/>
       <w:r>
         <w:lastRenderedPageBreak/>
         <w:t>4.9 Correlation Structure</w:t>
@@ -22490,7 +22499,7 @@
           <w:noProof/>
         </w:rPr>
         <w:drawing>
-          <wp:inline distT="0" distB="0" distL="0" distR="0" wp14:anchorId="41CB9E05" wp14:editId="3B7A0520">
+          <wp:inline distT="0" distB="0" distL="0" distR="0" wp14:anchorId="276C3476" wp14:editId="7D2550D4">
             <wp:extent cx="4846320" cy="4152226"/>
             <wp:effectExtent l="0" t="0" r="0" b="0"/>
             <wp:docPr id="12" name="Picture 12"/>
@@ -22530,7 +22539,7 @@
       <w:pPr>
         <w:pStyle w:val="FigCaption"/>
       </w:pPr>
-      <w:bookmarkStart w:id="49" w:name="_Toc242714330"/>
+      <w:bookmarkStart w:id="49" w:name="_Toc242726619"/>
       <w:r>
         <w:rPr>
           <w:b/>
@@ -22588,7 +22597,7 @@
       <w:pPr>
         <w:pStyle w:val="Heading2"/>
       </w:pPr>
-      <w:bookmarkStart w:id="50" w:name="_Toc242714290"/>
+      <w:bookmarkStart w:id="50" w:name="_Toc242726579"/>
       <w:r>
         <w:lastRenderedPageBreak/>
         <w:t>4.10 A Resistant Line for Pages and Time</w:t>
@@ -22606,7 +22615,7 @@
           <w:noProof/>
         </w:rPr>
         <w:drawing>
-          <wp:inline distT="0" distB="0" distL="0" distR="0" wp14:anchorId="53237843" wp14:editId="12C981CD">
+          <wp:inline distT="0" distB="0" distL="0" distR="0" wp14:anchorId="1B9ADD8A" wp14:editId="1F31A8D0">
             <wp:extent cx="4937760" cy="3366346"/>
             <wp:effectExtent l="0" t="0" r="0" b="0"/>
             <wp:docPr id="13" name="Picture 13"/>
@@ -22646,7 +22655,7 @@
       <w:pPr>
         <w:pStyle w:val="FigCaption"/>
       </w:pPr>
-      <w:bookmarkStart w:id="51" w:name="_Toc242714331"/>
+      <w:bookmarkStart w:id="51" w:name="_Toc242726620"/>
       <w:r>
         <w:rPr>
           <w:b/>
@@ -22713,7 +22722,7 @@
       <w:pPr>
         <w:pStyle w:val="Heading2"/>
       </w:pPr>
-      <w:bookmarkStart w:id="52" w:name="_Toc242714291"/>
+      <w:bookmarkStart w:id="52" w:name="_Toc242726580"/>
       <w:r>
         <w:t>4.11 Categorical Associations and a Third Variable</w:t>
       </w:r>
@@ -22723,7 +22732,7 @@
       <w:pPr>
         <w:pStyle w:val="TabCaption"/>
       </w:pPr>
-      <w:bookmarkStart w:id="53" w:name="_Toc242714355"/>
+      <w:bookmarkStart w:id="53" w:name="_Toc242726644"/>
       <w:r>
         <w:rPr>
           <w:b/>
@@ -24327,7 +24336,7 @@
           <w:noProof/>
         </w:rPr>
         <w:drawing>
-          <wp:inline distT="0" distB="0" distL="0" distR="0" wp14:anchorId="578558AF" wp14:editId="31A808CB">
+          <wp:inline distT="0" distB="0" distL="0" distR="0" wp14:anchorId="4F25F772" wp14:editId="7E92BFFB">
             <wp:extent cx="5486400" cy="2744881"/>
             <wp:effectExtent l="0" t="0" r="0" b="0"/>
             <wp:docPr id="14" name="Picture 14"/>
@@ -24367,7 +24376,7 @@
       <w:pPr>
         <w:pStyle w:val="FigCaption"/>
       </w:pPr>
-      <w:bookmarkStart w:id="54" w:name="_Toc242714332"/>
+      <w:bookmarkStart w:id="54" w:name="_Toc242726621"/>
       <w:r>
         <w:rPr>
           <w:b/>
@@ -24428,7 +24437,7 @@
       <w:pPr>
         <w:pStyle w:val="Heading2"/>
       </w:pPr>
-      <w:bookmarkStart w:id="55" w:name="_Toc242714292"/>
+      <w:bookmarkStart w:id="55" w:name="_Toc242726581"/>
       <w:r>
         <w:lastRenderedPageBreak/>
         <w:t>4.12 Multivariate View: Pair Plot</w:t>
@@ -24446,7 +24455,7 @@
           <w:noProof/>
         </w:rPr>
         <w:drawing>
-          <wp:inline distT="0" distB="0" distL="0" distR="0" wp14:anchorId="166617B5" wp14:editId="65A84AED">
+          <wp:inline distT="0" distB="0" distL="0" distR="0" wp14:anchorId="5EDBEBC7" wp14:editId="35F12B34">
             <wp:extent cx="5212080" cy="4959195"/>
             <wp:effectExtent l="0" t="0" r="0" b="0"/>
             <wp:docPr id="15" name="Picture 15"/>
@@ -24486,7 +24495,7 @@
       <w:pPr>
         <w:pStyle w:val="FigCaption"/>
       </w:pPr>
-      <w:bookmarkStart w:id="56" w:name="_Toc242714333"/>
+      <w:bookmarkStart w:id="56" w:name="_Toc242726622"/>
       <w:r>
         <w:rPr>
           <w:b/>
@@ -24544,7 +24553,7 @@
       <w:pPr>
         <w:pStyle w:val="Heading2"/>
       </w:pPr>
-      <w:bookmarkStart w:id="57" w:name="_Toc242714293"/>
+      <w:bookmarkStart w:id="57" w:name="_Toc242726582"/>
       <w:r>
         <w:lastRenderedPageBreak/>
         <w:t>4.13 Multivariate View: Principal Component Analysis</w:t>
@@ -24562,7 +24571,7 @@
           <w:noProof/>
         </w:rPr>
         <w:drawing>
-          <wp:inline distT="0" distB="0" distL="0" distR="0" wp14:anchorId="044F4D94" wp14:editId="715FD452">
+          <wp:inline distT="0" distB="0" distL="0" distR="0" wp14:anchorId="001331AD" wp14:editId="7B656DC5">
             <wp:extent cx="5486400" cy="2069391"/>
             <wp:effectExtent l="0" t="0" r="0" b="0"/>
             <wp:docPr id="16" name="Picture 16"/>
@@ -24602,7 +24611,7 @@
       <w:pPr>
         <w:pStyle w:val="FigCaption"/>
       </w:pPr>
-      <w:bookmarkStart w:id="58" w:name="_Toc242714334"/>
+      <w:bookmarkStart w:id="58" w:name="_Toc242726623"/>
       <w:r>
         <w:rPr>
           <w:b/>
@@ -24663,7 +24672,7 @@
       <w:pPr>
         <w:pStyle w:val="Heading2"/>
       </w:pPr>
-      <w:bookmarkStart w:id="59" w:name="_Toc242714294"/>
+      <w:bookmarkStart w:id="59" w:name="_Toc242726583"/>
       <w:r>
         <w:lastRenderedPageBreak/>
         <w:t>4.14 Interact: Exploratory Dashboard</w:t>
@@ -24681,7 +24690,7 @@
           <w:noProof/>
         </w:rPr>
         <w:drawing>
-          <wp:inline distT="0" distB="0" distL="0" distR="0" wp14:anchorId="0461386A" wp14:editId="20BE0045">
+          <wp:inline distT="0" distB="0" distL="0" distR="0" wp14:anchorId="7D311A0C" wp14:editId="5FC1332C">
             <wp:extent cx="5486400" cy="4473526"/>
             <wp:effectExtent l="0" t="0" r="0" b="0"/>
             <wp:docPr id="17" name="Picture 17"/>
@@ -24721,7 +24730,7 @@
       <w:pPr>
         <w:pStyle w:val="FigCaption"/>
       </w:pPr>
-      <w:bookmarkStart w:id="60" w:name="_Toc242714335"/>
+      <w:bookmarkStart w:id="60" w:name="_Toc242726624"/>
       <w:r>
         <w:rPr>
           <w:b/>
@@ -24779,7 +24788,7 @@
       <w:pPr>
         <w:pStyle w:val="Heading2"/>
       </w:pPr>
-      <w:bookmarkStart w:id="61" w:name="_Toc242714295"/>
+      <w:bookmarkStart w:id="61" w:name="_Toc242726584"/>
       <w:r>
         <w:lastRenderedPageBreak/>
         <w:t>4.15 Summary of Statistical Findings</w:t>
@@ -24790,7 +24799,7 @@
       <w:pPr>
         <w:pStyle w:val="TabCaption"/>
       </w:pPr>
-      <w:bookmarkStart w:id="62" w:name="_Toc242714356"/>
+      <w:bookmarkStart w:id="62" w:name="_Toc242726645"/>
       <w:r>
         <w:rPr>
           <w:b/>
@@ -25597,7 +25606,7 @@
         <w:pStyle w:val="Heading1"/>
         <w:pageBreakBefore/>
       </w:pPr>
-      <w:bookmarkStart w:id="63" w:name="_Toc242714296"/>
+      <w:bookmarkStart w:id="63" w:name="_Toc242726585"/>
       <w:r>
         <w:lastRenderedPageBreak/>
         <w:t>5. DEEP LEARNING MODEL</w:t>
@@ -25608,7 +25617,7 @@
       <w:pPr>
         <w:pStyle w:val="Heading2"/>
       </w:pPr>
-      <w:bookmarkStart w:id="64" w:name="_Toc242714297"/>
+      <w:bookmarkStart w:id="64" w:name="_Toc242726586"/>
       <w:r>
         <w:t>5.1 Choice of Model</w:t>
       </w:r>
@@ -25638,7 +25647,7 @@
       <w:pPr>
         <w:pStyle w:val="Heading2"/>
       </w:pPr>
-      <w:bookmarkStart w:id="65" w:name="_Toc242714298"/>
+      <w:bookmarkStart w:id="65" w:name="_Toc242726587"/>
       <w:r>
         <w:t>5.2 Architecture</w:t>
       </w:r>
@@ -25655,7 +25664,7 @@
           <w:noProof/>
         </w:rPr>
         <w:drawing>
-          <wp:inline distT="0" distB="0" distL="0" distR="0" wp14:anchorId="341D0EAA" wp14:editId="59C8610E">
+          <wp:inline distT="0" distB="0" distL="0" distR="0" wp14:anchorId="11D4FFB8" wp14:editId="3362FC6D">
             <wp:extent cx="5486400" cy="1225070"/>
             <wp:effectExtent l="0" t="0" r="0" b="0"/>
             <wp:docPr id="18" name="Picture 18"/>
@@ -25695,7 +25704,7 @@
       <w:pPr>
         <w:pStyle w:val="FigCaption"/>
       </w:pPr>
-      <w:bookmarkStart w:id="66" w:name="_Toc242714336"/>
+      <w:bookmarkStart w:id="66" w:name="_Toc242726625"/>
       <w:r>
         <w:rPr>
           <w:b/>
@@ -25711,7 +25720,7 @@
       <w:pPr>
         <w:pStyle w:val="TabCaption"/>
       </w:pPr>
-      <w:bookmarkStart w:id="67" w:name="_Toc242714357"/>
+      <w:bookmarkStart w:id="67" w:name="_Toc242726646"/>
       <w:r>
         <w:rPr>
           <w:b/>
@@ -26439,7 +26448,7 @@
       <w:pPr>
         <w:pStyle w:val="Heading2"/>
       </w:pPr>
-      <w:bookmarkStart w:id="68" w:name="_Toc242714299"/>
+      <w:bookmarkStart w:id="68" w:name="_Toc242726588"/>
       <w:r>
         <w:lastRenderedPageBreak/>
         <w:t>5.3 Training Parameters</w:t>
@@ -26450,7 +26459,7 @@
       <w:pPr>
         <w:pStyle w:val="TabCaption"/>
       </w:pPr>
-      <w:bookmarkStart w:id="69" w:name="_Toc242714358"/>
+      <w:bookmarkStart w:id="69" w:name="_Toc242726647"/>
       <w:r>
         <w:rPr>
           <w:b/>
@@ -27070,7 +27079,7 @@
       <w:pPr>
         <w:pStyle w:val="Heading2"/>
       </w:pPr>
-      <w:bookmarkStart w:id="70" w:name="_Toc242714300"/>
+      <w:bookmarkStart w:id="70" w:name="_Toc242726589"/>
       <w:r>
         <w:t>5.4 Hyperparameter Tuning</w:t>
       </w:r>
@@ -27088,7 +27097,7 @@
       <w:pPr>
         <w:pStyle w:val="TabCaption"/>
       </w:pPr>
-      <w:bookmarkStart w:id="71" w:name="_Toc242714359"/>
+      <w:bookmarkStart w:id="71" w:name="_Toc242726648"/>
       <w:r>
         <w:rPr>
           <w:b/>
@@ -30721,7 +30730,7 @@
         </w:rPr>
         <w:lastRenderedPageBreak/>
         <w:drawing>
-          <wp:inline distT="0" distB="0" distL="0" distR="0" wp14:anchorId="774032FE" wp14:editId="74F14377">
+          <wp:inline distT="0" distB="0" distL="0" distR="0" wp14:anchorId="777ABF7B" wp14:editId="3B10C260">
             <wp:extent cx="5486400" cy="2162666"/>
             <wp:effectExtent l="0" t="0" r="0" b="0"/>
             <wp:docPr id="19" name="Picture 19"/>
@@ -30761,7 +30770,7 @@
       <w:pPr>
         <w:pStyle w:val="FigCaption"/>
       </w:pPr>
-      <w:bookmarkStart w:id="72" w:name="_Toc242714337"/>
+      <w:bookmarkStart w:id="72" w:name="_Toc242726626"/>
       <w:r>
         <w:rPr>
           <w:b/>
@@ -30819,7 +30828,7 @@
       <w:pPr>
         <w:pStyle w:val="Heading2"/>
       </w:pPr>
-      <w:bookmarkStart w:id="73" w:name="_Toc242714301"/>
+      <w:bookmarkStart w:id="73" w:name="_Toc242726590"/>
       <w:r>
         <w:t>5.5 Feature Analysis and Importance</w:t>
       </w:r>
@@ -30836,7 +30845,7 @@
           <w:noProof/>
         </w:rPr>
         <w:drawing>
-          <wp:inline distT="0" distB="0" distL="0" distR="0" wp14:anchorId="66B61C8C" wp14:editId="73720B7C">
+          <wp:inline distT="0" distB="0" distL="0" distR="0" wp14:anchorId="0CFDBDE9" wp14:editId="7D6B4FBC">
             <wp:extent cx="5486400" cy="2169892"/>
             <wp:effectExtent l="0" t="0" r="0" b="0"/>
             <wp:docPr id="20" name="Picture 20"/>
@@ -30876,7 +30885,7 @@
       <w:pPr>
         <w:pStyle w:val="FigCaption"/>
       </w:pPr>
-      <w:bookmarkStart w:id="74" w:name="_Toc242714338"/>
+      <w:bookmarkStart w:id="74" w:name="_Toc242726627"/>
       <w:r>
         <w:rPr>
           <w:b/>
@@ -30938,7 +30947,7 @@
       <w:pPr>
         <w:pStyle w:val="Heading2"/>
       </w:pPr>
-      <w:bookmarkStart w:id="75" w:name="_Toc242714302"/>
+      <w:bookmarkStart w:id="75" w:name="_Toc242726591"/>
       <w:r>
         <w:t>5.6 Baseline for Comparison</w:t>
       </w:r>
@@ -30957,7 +30966,7 @@
         <w:pStyle w:val="Heading1"/>
         <w:pageBreakBefore/>
       </w:pPr>
-      <w:bookmarkStart w:id="76" w:name="_Toc242714303"/>
+      <w:bookmarkStart w:id="76" w:name="_Toc242726592"/>
       <w:r>
         <w:lastRenderedPageBreak/>
         <w:t>6. RESULT VISUALIZATION AND INTERPRETATION</w:t>
@@ -30976,7 +30985,7 @@
       <w:pPr>
         <w:pStyle w:val="Heading2"/>
       </w:pPr>
-      <w:bookmarkStart w:id="77" w:name="_Toc242714304"/>
+      <w:bookmarkStart w:id="77" w:name="_Toc242726593"/>
       <w:r>
         <w:t>6.1 Loss versus Epoch</w:t>
       </w:r>
@@ -30993,7 +31002,7 @@
           <w:noProof/>
         </w:rPr>
         <w:drawing>
-          <wp:inline distT="0" distB="0" distL="0" distR="0" wp14:anchorId="792F9213" wp14:editId="3103D0D3">
+          <wp:inline distT="0" distB="0" distL="0" distR="0" wp14:anchorId="18DED310" wp14:editId="3753D8B7">
             <wp:extent cx="5486400" cy="2749923"/>
             <wp:effectExtent l="0" t="0" r="0" b="0"/>
             <wp:docPr id="21" name="Picture 21"/>
@@ -31033,7 +31042,7 @@
       <w:pPr>
         <w:pStyle w:val="FigCaption"/>
       </w:pPr>
-      <w:bookmarkStart w:id="78" w:name="_Toc242714339"/>
+      <w:bookmarkStart w:id="78" w:name="_Toc242726628"/>
       <w:r>
         <w:rPr>
           <w:b/>
@@ -31091,7 +31100,7 @@
       <w:pPr>
         <w:pStyle w:val="Heading2"/>
       </w:pPr>
-      <w:bookmarkStart w:id="79" w:name="_Toc242714305"/>
+      <w:bookmarkStart w:id="79" w:name="_Toc242726594"/>
       <w:r>
         <w:lastRenderedPageBreak/>
         <w:t>6.2 Accuracy and ROC-AUC versus Epoch</w:t>
@@ -31109,7 +31118,7 @@
           <w:noProof/>
         </w:rPr>
         <w:drawing>
-          <wp:inline distT="0" distB="0" distL="0" distR="0" wp14:anchorId="7A6EF41C" wp14:editId="0D97BEA0">
+          <wp:inline distT="0" distB="0" distL="0" distR="0" wp14:anchorId="26ADBE65" wp14:editId="726E0154">
             <wp:extent cx="5486400" cy="1767891"/>
             <wp:effectExtent l="0" t="0" r="0" b="0"/>
             <wp:docPr id="22" name="Picture 22"/>
@@ -31149,7 +31158,7 @@
       <w:pPr>
         <w:pStyle w:val="FigCaption"/>
       </w:pPr>
-      <w:bookmarkStart w:id="80" w:name="_Toc242714340"/>
+      <w:bookmarkStart w:id="80" w:name="_Toc242726629"/>
       <w:r>
         <w:rPr>
           <w:b/>
@@ -31207,7 +31216,7 @@
       <w:pPr>
         <w:pStyle w:val="Heading2"/>
       </w:pPr>
-      <w:bookmarkStart w:id="81" w:name="_Toc242714306"/>
+      <w:bookmarkStart w:id="81" w:name="_Toc242726595"/>
       <w:r>
         <w:t>6.3 Confusion Matrix</w:t>
       </w:r>
@@ -31224,7 +31233,7 @@
           <w:noProof/>
         </w:rPr>
         <w:drawing>
-          <wp:inline distT="0" distB="0" distL="0" distR="0" wp14:anchorId="1178BBB2" wp14:editId="5FC55EA6">
+          <wp:inline distT="0" distB="0" distL="0" distR="0" wp14:anchorId="0135EF27" wp14:editId="0D24538F">
             <wp:extent cx="5486400" cy="2432571"/>
             <wp:effectExtent l="0" t="0" r="0" b="0"/>
             <wp:docPr id="23" name="Picture 23"/>
@@ -31264,7 +31273,7 @@
       <w:pPr>
         <w:pStyle w:val="FigCaption"/>
       </w:pPr>
-      <w:bookmarkStart w:id="82" w:name="_Toc242714341"/>
+      <w:bookmarkStart w:id="82" w:name="_Toc242726630"/>
       <w:r>
         <w:rPr>
           <w:b/>
@@ -31323,7 +31332,7 @@
       <w:pPr>
         <w:pStyle w:val="Heading2"/>
       </w:pPr>
-      <w:bookmarkStart w:id="83" w:name="_Toc242714307"/>
+      <w:bookmarkStart w:id="83" w:name="_Toc242726596"/>
       <w:r>
         <w:t>6.4 ROC Curve and AUC</w:t>
       </w:r>
@@ -31340,7 +31349,7 @@
           <w:noProof/>
         </w:rPr>
         <w:drawing>
-          <wp:inline distT="0" distB="0" distL="0" distR="0" wp14:anchorId="31CCEEFB" wp14:editId="1DF8E382">
+          <wp:inline distT="0" distB="0" distL="0" distR="0" wp14:anchorId="45A644C1" wp14:editId="16A8811C">
             <wp:extent cx="4206240" cy="3745425"/>
             <wp:effectExtent l="0" t="0" r="0" b="0"/>
             <wp:docPr id="24" name="Picture 24"/>
@@ -31380,7 +31389,7 @@
       <w:pPr>
         <w:pStyle w:val="FigCaption"/>
       </w:pPr>
-      <w:bookmarkStart w:id="84" w:name="_Toc242714342"/>
+      <w:bookmarkStart w:id="84" w:name="_Toc242726631"/>
       <w:r>
         <w:rPr>
           <w:b/>
@@ -31447,7 +31456,7 @@
       <w:pPr>
         <w:pStyle w:val="Heading2"/>
       </w:pPr>
-      <w:bookmarkStart w:id="85" w:name="_Toc242714308"/>
+      <w:bookmarkStart w:id="85" w:name="_Toc242726597"/>
       <w:r>
         <w:lastRenderedPageBreak/>
         <w:t>6.5 Precision-Recall Curve and Threshold Analysis</w:t>
@@ -31465,7 +31474,7 @@
           <w:noProof/>
         </w:rPr>
         <w:drawing>
-          <wp:inline distT="0" distB="0" distL="0" distR="0" wp14:anchorId="703CC146" wp14:editId="65CF8C78">
+          <wp:inline distT="0" distB="0" distL="0" distR="0" wp14:anchorId="596DDB00" wp14:editId="667761F2">
             <wp:extent cx="5486400" cy="1917155"/>
             <wp:effectExtent l="0" t="0" r="0" b="0"/>
             <wp:docPr id="25" name="Picture 25"/>
@@ -31505,7 +31514,7 @@
       <w:pPr>
         <w:pStyle w:val="FigCaption"/>
       </w:pPr>
-      <w:bookmarkStart w:id="86" w:name="_Toc242714343"/>
+      <w:bookmarkStart w:id="86" w:name="_Toc242726632"/>
       <w:r>
         <w:rPr>
           <w:b/>
@@ -31572,7 +31581,7 @@
       <w:pPr>
         <w:pStyle w:val="Heading2"/>
       </w:pPr>
-      <w:bookmarkStart w:id="87" w:name="_Toc242714309"/>
+      <w:bookmarkStart w:id="87" w:name="_Toc242726598"/>
       <w:r>
         <w:t>6.6 Score Distribution and Error Analysis</w:t>
       </w:r>
@@ -31589,7 +31598,7 @@
           <w:noProof/>
         </w:rPr>
         <w:drawing>
-          <wp:inline distT="0" distB="0" distL="0" distR="0" wp14:anchorId="664CC31D" wp14:editId="29E6227A">
+          <wp:inline distT="0" distB="0" distL="0" distR="0" wp14:anchorId="0CF55DAE" wp14:editId="3C178ABE">
             <wp:extent cx="5486400" cy="2502341"/>
             <wp:effectExtent l="0" t="0" r="0" b="0"/>
             <wp:docPr id="26" name="Picture 26"/>
@@ -31629,7 +31638,7 @@
       <w:pPr>
         <w:pStyle w:val="FigCaption"/>
       </w:pPr>
-      <w:bookmarkStart w:id="88" w:name="_Toc242714344"/>
+      <w:bookmarkStart w:id="88" w:name="_Toc242726633"/>
       <w:r>
         <w:rPr>
           <w:b/>
@@ -31688,7 +31697,7 @@
       <w:pPr>
         <w:pStyle w:val="Heading2"/>
       </w:pPr>
-      <w:bookmarkStart w:id="89" w:name="_Toc242714310"/>
+      <w:bookmarkStart w:id="89" w:name="_Toc242726599"/>
       <w:r>
         <w:t>6.7 Summary of Test Performance</w:t>
       </w:r>
@@ -31698,7 +31707,7 @@
       <w:pPr>
         <w:pStyle w:val="TabCaption"/>
       </w:pPr>
-      <w:bookmarkStart w:id="90" w:name="_Toc242714360"/>
+      <w:bookmarkStart w:id="90" w:name="_Toc242726649"/>
       <w:r>
         <w:rPr>
           <w:b/>
@@ -33159,7 +33168,7 @@
         <w:pStyle w:val="Heading1"/>
         <w:pageBreakBefore/>
       </w:pPr>
-      <w:bookmarkStart w:id="91" w:name="_Toc242714311"/>
+      <w:bookmarkStart w:id="91" w:name="_Toc242726600"/>
       <w:r>
         <w:lastRenderedPageBreak/>
         <w:t>7. CONCLUSION AND FUTURE SCOPE</w:t>
@@ -33170,7 +33179,7 @@
       <w:pPr>
         <w:pStyle w:val="Heading2"/>
       </w:pPr>
-      <w:bookmarkStart w:id="92" w:name="_Toc242714312"/>
+      <w:bookmarkStart w:id="92" w:name="_Toc242726601"/>
       <w:r>
         <w:t>7.1 What the Data Revealed</w:t>
       </w:r>
@@ -33225,7 +33234,7 @@
       <w:pPr>
         <w:pStyle w:val="Heading2"/>
       </w:pPr>
-      <w:bookmarkStart w:id="93" w:name="_Toc242714313"/>
+      <w:bookmarkStart w:id="93" w:name="_Toc242726602"/>
       <w:r>
         <w:t>7.2 How the Model Performed</w:t>
       </w:r>
@@ -33243,7 +33252,7 @@
       <w:pPr>
         <w:pStyle w:val="Heading2"/>
       </w:pPr>
-      <w:bookmarkStart w:id="94" w:name="_Toc242714314"/>
+      <w:bookmarkStart w:id="94" w:name="_Toc242726603"/>
       <w:r>
         <w:t>7.3 Challenges Faced</w:t>
       </w:r>
@@ -33298,7 +33307,7 @@
       <w:pPr>
         <w:pStyle w:val="Heading2"/>
       </w:pPr>
-      <w:bookmarkStart w:id="95" w:name="_Toc242714315"/>
+      <w:bookmarkStart w:id="95" w:name="_Toc242726604"/>
       <w:r>
         <w:lastRenderedPageBreak/>
         <w:t>7.4 Recommendations for the Retailer</w:t>
@@ -33345,7 +33354,7 @@
       <w:pPr>
         <w:pStyle w:val="Heading2"/>
       </w:pPr>
-      <w:bookmarkStart w:id="96" w:name="_Toc242714316"/>
+      <w:bookmarkStart w:id="96" w:name="_Toc242726605"/>
       <w:r>
         <w:t>7.5 Future Scope</w:t>
       </w:r>
@@ -33401,7 +33410,7 @@
         <w:pStyle w:val="Heading1"/>
         <w:pageBreakBefore/>
       </w:pPr>
-      <w:bookmarkStart w:id="97" w:name="_Toc242714317"/>
+      <w:bookmarkStart w:id="97" w:name="_Toc242726606"/>
       <w:r>
         <w:lastRenderedPageBreak/>
         <w:t>REFERENCES</w:t>
@@ -33674,7 +33683,7 @@
         <w:pStyle w:val="Heading1"/>
         <w:pageBreakBefore/>
       </w:pPr>
-      <w:bookmarkStart w:id="98" w:name="_Toc242714318"/>
+      <w:bookmarkStart w:id="98" w:name="_Toc242726607"/>
       <w:r>
         <w:lastRenderedPageBreak/>
         <w:t>APPENDIX A: PROJECT REPOSITORY AND REPRODUCIBILITY</w:t>
@@ -33859,7 +33868,7 @@
         <w:pStyle w:val="Heading1"/>
         <w:pageBreakBefore/>
       </w:pPr>
-      <w:bookmarkStart w:id="99" w:name="_Toc242714319"/>
+      <w:bookmarkStart w:id="99" w:name="_Toc242726608"/>
       <w:r>
         <w:lastRenderedPageBreak/>
         <w:t>APPENDIX B: SOURCE CODE (KEY SECTIONS)</w:t>
@@ -36506,31 +36515,31 @@
       </w:rPr>
     </w:lvl>
   </w:abstractNum>
-  <w:num w:numId="1" w16cid:durableId="954561148">
+  <w:num w:numId="1" w16cid:durableId="1892375038">
     <w:abstractNumId w:val="8"/>
   </w:num>
-  <w:num w:numId="2" w16cid:durableId="1878616192">
+  <w:num w:numId="2" w16cid:durableId="830876290">
     <w:abstractNumId w:val="6"/>
   </w:num>
-  <w:num w:numId="3" w16cid:durableId="1660500779">
+  <w:num w:numId="3" w16cid:durableId="780535703">
     <w:abstractNumId w:val="5"/>
   </w:num>
-  <w:num w:numId="4" w16cid:durableId="1207910303">
+  <w:num w:numId="4" w16cid:durableId="1067730895">
     <w:abstractNumId w:val="4"/>
   </w:num>
-  <w:num w:numId="5" w16cid:durableId="483158596">
+  <w:num w:numId="5" w16cid:durableId="517231075">
     <w:abstractNumId w:val="7"/>
   </w:num>
-  <w:num w:numId="6" w16cid:durableId="1421098291">
+  <w:num w:numId="6" w16cid:durableId="1470709747">
     <w:abstractNumId w:val="3"/>
   </w:num>
-  <w:num w:numId="7" w16cid:durableId="1015302674">
+  <w:num w:numId="7" w16cid:durableId="371804917">
     <w:abstractNumId w:val="2"/>
   </w:num>
-  <w:num w:numId="8" w16cid:durableId="403378226">
+  <w:num w:numId="8" w16cid:durableId="403845177">
     <w:abstractNumId w:val="1"/>
   </w:num>
-  <w:num w:numId="9" w16cid:durableId="1233850216">
+  <w:num w:numId="9" w16cid:durableId="1605920181">
     <w:abstractNumId w:val="0"/>
   </w:num>
 </w:numbering>
@@ -48023,7 +48032,7 @@
     <w:autoRedefine/>
     <w:uiPriority w:val="39"/>
     <w:unhideWhenUsed/>
-    <w:rsid w:val="00E2154F"/>
+    <w:rsid w:val="00AC1E4F"/>
     <w:pPr>
       <w:spacing w:after="100"/>
     </w:pPr>
@@ -48035,7 +48044,7 @@
     <w:autoRedefine/>
     <w:uiPriority w:val="39"/>
     <w:unhideWhenUsed/>
-    <w:rsid w:val="00E2154F"/>
+    <w:rsid w:val="00AC1E4F"/>
     <w:pPr>
       <w:spacing w:after="100"/>
       <w:ind w:left="240"/>
@@ -48046,7 +48055,7 @@
     <w:basedOn w:val="DefaultParagraphFont"/>
     <w:uiPriority w:val="99"/>
     <w:unhideWhenUsed/>
-    <w:rsid w:val="00E2154F"/>
+    <w:rsid w:val="00AC1E4F"/>
     <w:rPr>
       <w:color w:val="0000FF" w:themeColor="hyperlink"/>
       <w:u w:val="single"/>

</xml_diff>